<commit_message>
format fuzzer docs updated
</commit_message>
<xml_diff>
--- a/docs_llm/FormatFuzzer Benchmarking Report.docx
+++ b/docs_llm/FormatFuzzer Benchmarking Report.docx
@@ -11187,6 +11187,9 @@
               <w:jc w:val="center"/>
               <w:cnfStyle w:val="000000100000" w:firstRow="0" w:lastRow="0" w:firstColumn="0" w:lastColumn="0" w:oddVBand="0" w:evenVBand="0" w:oddHBand="1" w:evenHBand="0" w:firstRowFirstColumn="0" w:firstRowLastColumn="0" w:lastRowFirstColumn="0" w:lastRowLastColumn="0"/>
             </w:pPr>
+            <w:r>
+              <w:t>3.5%</w:t>
+            </w:r>
           </w:p>
         </w:tc>
         <w:tc>
@@ -11199,6 +11202,9 @@
               <w:jc w:val="center"/>
               <w:cnfStyle w:val="000000100000" w:firstRow="0" w:lastRow="0" w:firstColumn="0" w:lastColumn="0" w:oddVBand="0" w:evenVBand="0" w:oddHBand="1" w:evenHBand="0" w:firstRowFirstColumn="0" w:firstRowLastColumn="0" w:lastRowFirstColumn="0" w:lastRowLastColumn="0"/>
             </w:pPr>
+            <w:r>
+              <w:t>FFmpeg 6.1</w:t>
+            </w:r>
           </w:p>
         </w:tc>
       </w:tr>
@@ -11306,6 +11312,9 @@
               <w:jc w:val="center"/>
               <w:cnfStyle w:val="000000010000" w:firstRow="0" w:lastRow="0" w:firstColumn="0" w:lastColumn="0" w:oddVBand="0" w:evenVBand="0" w:oddHBand="0" w:evenHBand="1" w:firstRowFirstColumn="0" w:firstRowLastColumn="0" w:lastRowFirstColumn="0" w:lastRowLastColumn="0"/>
             </w:pPr>
+            <w:r>
+              <w:t>14.5%</w:t>
+            </w:r>
           </w:p>
         </w:tc>
         <w:tc>
@@ -11318,6 +11327,9 @@
               <w:jc w:val="center"/>
               <w:cnfStyle w:val="000000010000" w:firstRow="0" w:lastRow="0" w:firstColumn="0" w:lastColumn="0" w:oddVBand="0" w:evenVBand="0" w:oddHBand="0" w:evenHBand="1" w:firstRowFirstColumn="0" w:firstRowLastColumn="0" w:lastRowFirstColumn="0" w:lastRowLastColumn="0"/>
             </w:pPr>
+            <w:r>
+              <w:t>gdk-pixbuf 2.42.12</w:t>
+            </w:r>
           </w:p>
         </w:tc>
       </w:tr>
@@ -11431,6 +11443,9 @@
               <w:jc w:val="center"/>
               <w:cnfStyle w:val="000000100000" w:firstRow="0" w:lastRow="0" w:firstColumn="0" w:lastColumn="0" w:oddVBand="0" w:evenVBand="0" w:oddHBand="1" w:evenHBand="0" w:firstRowFirstColumn="0" w:firstRowLastColumn="0" w:lastRowFirstColumn="0" w:lastRowLastColumn="0"/>
             </w:pPr>
+            <w:r>
+              <w:t>24.5%</w:t>
+            </w:r>
           </w:p>
         </w:tc>
         <w:tc>
@@ -11443,6 +11458,9 @@
               <w:jc w:val="center"/>
               <w:cnfStyle w:val="000000100000" w:firstRow="0" w:lastRow="0" w:firstColumn="0" w:lastColumn="0" w:oddVBand="0" w:evenVBand="0" w:oddHBand="1" w:evenHBand="0" w:firstRowFirstColumn="0" w:firstRowLastColumn="0" w:lastRowFirstColumn="0" w:lastRowLastColumn="0"/>
             </w:pPr>
+            <w:r>
+              <w:t>giflib 5.2.2 (gif2rgb)</w:t>
+            </w:r>
           </w:p>
         </w:tc>
       </w:tr>
@@ -11550,6 +11568,9 @@
               <w:jc w:val="center"/>
               <w:cnfStyle w:val="000000010000" w:firstRow="0" w:lastRow="0" w:firstColumn="0" w:lastColumn="0" w:oddVBand="0" w:evenVBand="0" w:oddHBand="0" w:evenHBand="1" w:firstRowFirstColumn="0" w:firstRowLastColumn="0" w:lastRowFirstColumn="0" w:lastRowLastColumn="0"/>
             </w:pPr>
+            <w:r>
+              <w:t>9.8%</w:t>
+            </w:r>
           </w:p>
         </w:tc>
         <w:tc>
@@ -11562,6 +11583,9 @@
               <w:jc w:val="center"/>
               <w:cnfStyle w:val="000000010000" w:firstRow="0" w:lastRow="0" w:firstColumn="0" w:lastColumn="0" w:oddVBand="0" w:evenVBand="0" w:oddHBand="0" w:evenHBand="1" w:firstRowFirstColumn="0" w:firstRowLastColumn="0" w:lastRowFirstColumn="0" w:lastRowLastColumn="0"/>
             </w:pPr>
+            <w:r>
+              <w:t>libjpeg-turbo 3.2.0 (djpeg)</w:t>
+            </w:r>
           </w:p>
         </w:tc>
       </w:tr>
@@ -11669,6 +11693,9 @@
               <w:jc w:val="center"/>
               <w:cnfStyle w:val="000000100000" w:firstRow="0" w:lastRow="0" w:firstColumn="0" w:lastColumn="0" w:oddVBand="0" w:evenVBand="0" w:oddHBand="1" w:evenHBand="0" w:firstRowFirstColumn="0" w:firstRowLastColumn="0" w:lastRowFirstColumn="0" w:lastRowLastColumn="0"/>
             </w:pPr>
+            <w:r>
+              <w:t>8.4%</w:t>
+            </w:r>
           </w:p>
         </w:tc>
         <w:tc>
@@ -11681,6 +11708,9 @@
               <w:jc w:val="center"/>
               <w:cnfStyle w:val="000000100000" w:firstRow="0" w:lastRow="0" w:firstColumn="0" w:lastColumn="0" w:oddVBand="0" w:evenVBand="0" w:oddHBand="1" w:evenHBand="0" w:firstRowFirstColumn="0" w:firstRowLastColumn="0" w:lastRowFirstColumn="0" w:lastRowLastColumn="0"/>
             </w:pPr>
+            <w:r>
+              <w:t>TiMidity++ 2.15.0</w:t>
+            </w:r>
           </w:p>
         </w:tc>
       </w:tr>
@@ -11788,6 +11818,9 @@
               <w:jc w:val="center"/>
               <w:cnfStyle w:val="000000010000" w:firstRow="0" w:lastRow="0" w:firstColumn="0" w:lastColumn="0" w:oddVBand="0" w:evenVBand="0" w:oddHBand="0" w:evenHBand="1" w:firstRowFirstColumn="0" w:firstRowLastColumn="0" w:lastRowFirstColumn="0" w:lastRowLastColumn="0"/>
             </w:pPr>
+            <w:r>
+              <w:t>n/a</w:t>
+            </w:r>
           </w:p>
         </w:tc>
         <w:tc>
@@ -11800,6 +11833,9 @@
               <w:jc w:val="center"/>
               <w:cnfStyle w:val="000000010000" w:firstRow="0" w:lastRow="0" w:firstColumn="0" w:lastColumn="0" w:oddVBand="0" w:evenVBand="0" w:oddHBand="0" w:evenHBand="1" w:firstRowFirstColumn="0" w:firstRowLastColumn="0" w:lastRowFirstColumn="0" w:lastRowLastColumn="0"/>
             </w:pPr>
+            <w:r>
+              <w:t>—</w:t>
+            </w:r>
           </w:p>
         </w:tc>
       </w:tr>
@@ -11907,6 +11943,9 @@
               <w:jc w:val="center"/>
               <w:cnfStyle w:val="000000100000" w:firstRow="0" w:lastRow="0" w:firstColumn="0" w:lastColumn="0" w:oddVBand="0" w:evenVBand="0" w:oddHBand="1" w:evenHBand="0" w:firstRowFirstColumn="0" w:firstRowLastColumn="0" w:lastRowFirstColumn="0" w:lastRowLastColumn="0"/>
             </w:pPr>
+            <w:r>
+              <w:t>1.6%</w:t>
+            </w:r>
           </w:p>
         </w:tc>
         <w:tc>
@@ -11919,6 +11958,9 @@
               <w:jc w:val="center"/>
               <w:cnfStyle w:val="000000100000" w:firstRow="0" w:lastRow="0" w:firstColumn="0" w:lastColumn="0" w:oddVBand="0" w:evenVBand="0" w:oddHBand="1" w:evenHBand="0" w:firstRowFirstColumn="0" w:firstRowLastColumn="0" w:lastRowFirstColumn="0" w:lastRowLastColumn="0"/>
             </w:pPr>
+            <w:r>
+              <w:t>FFmpeg 6.1</w:t>
+            </w:r>
           </w:p>
         </w:tc>
       </w:tr>
@@ -12031,6 +12073,9 @@
               <w:jc w:val="center"/>
               <w:cnfStyle w:val="000000010000" w:firstRow="0" w:lastRow="0" w:firstColumn="0" w:lastColumn="0" w:oddVBand="0" w:evenVBand="0" w:oddHBand="0" w:evenHBand="1" w:firstRowFirstColumn="0" w:firstRowLastColumn="0" w:lastRowFirstColumn="0" w:lastRowLastColumn="0"/>
             </w:pPr>
+            <w:r>
+              <w:t>21.8%</w:t>
+            </w:r>
           </w:p>
         </w:tc>
         <w:tc>
@@ -12043,6 +12088,9 @@
               <w:jc w:val="center"/>
               <w:cnfStyle w:val="000000010000" w:firstRow="0" w:lastRow="0" w:firstColumn="0" w:lastColumn="0" w:oddVBand="0" w:evenVBand="0" w:oddHBand="0" w:evenHBand="1" w:firstRowFirstColumn="0" w:firstRowLastColumn="0" w:lastRowFirstColumn="0" w:lastRowLastColumn="0"/>
             </w:pPr>
+            <w:r>
+              <w:t>libpng 1.6.57 (pngtest)</w:t>
+            </w:r>
           </w:p>
         </w:tc>
       </w:tr>
@@ -12154,6 +12202,9 @@
               <w:jc w:val="center"/>
               <w:cnfStyle w:val="000000100000" w:firstRow="0" w:lastRow="0" w:firstColumn="0" w:lastColumn="0" w:oddVBand="0" w:evenVBand="0" w:oddHBand="1" w:evenHBand="0" w:firstRowFirstColumn="0" w:firstRowLastColumn="0" w:lastRowFirstColumn="0" w:lastRowLastColumn="0"/>
             </w:pPr>
+            <w:r>
+              <w:t>22.0%</w:t>
+            </w:r>
           </w:p>
         </w:tc>
         <w:tc>
@@ -12166,6 +12217,9 @@
               <w:jc w:val="center"/>
               <w:cnfStyle w:val="000000100000" w:firstRow="0" w:lastRow="0" w:firstColumn="0" w:lastColumn="0" w:oddVBand="0" w:evenVBand="0" w:oddHBand="1" w:evenHBand="0" w:firstRowFirstColumn="0" w:firstRowLastColumn="0" w:lastRowFirstColumn="0" w:lastRowLastColumn="0"/>
             </w:pPr>
+            <w:r>
+              <w:t>WavPack 5.9.0</w:t>
+            </w:r>
           </w:p>
         </w:tc>
       </w:tr>
@@ -12273,6 +12327,9 @@
               <w:jc w:val="center"/>
               <w:cnfStyle w:val="000000010000" w:firstRow="0" w:lastRow="0" w:firstColumn="0" w:lastColumn="0" w:oddVBand="0" w:evenVBand="0" w:oddHBand="0" w:evenHBand="1" w:firstRowFirstColumn="0" w:firstRowLastColumn="0" w:lastRowFirstColumn="0" w:lastRowLastColumn="0"/>
             </w:pPr>
+            <w:r>
+              <w:t>15.1%</w:t>
+            </w:r>
           </w:p>
         </w:tc>
         <w:tc>
@@ -12285,6 +12342,9 @@
               <w:jc w:val="center"/>
               <w:cnfStyle w:val="000000010000" w:firstRow="0" w:lastRow="0" w:firstColumn="0" w:lastColumn="0" w:oddVBand="0" w:evenVBand="0" w:oddHBand="0" w:evenHBand="1" w:firstRowFirstColumn="0" w:firstRowLastColumn="0" w:lastRowFirstColumn="0" w:lastRowLastColumn="0"/>
             </w:pPr>
+            <w:r>
+              <w:t>Info-ZIP UnZip 6.0</w:t>
+            </w:r>
           </w:p>
         </w:tc>
       </w:tr>
@@ -12397,6 +12457,9 @@
               <w:jc w:val="center"/>
               <w:cnfStyle w:val="000000100000" w:firstRow="0" w:lastRow="0" w:firstColumn="0" w:lastColumn="0" w:oddVBand="0" w:evenVBand="0" w:oddHBand="1" w:evenHBand="0" w:firstRowFirstColumn="0" w:firstRowLastColumn="0" w:lastRowFirstColumn="0" w:lastRowLastColumn="0"/>
             </w:pPr>
+            <w:r>
+              <w:t>4.5%</w:t>
+            </w:r>
           </w:p>
         </w:tc>
         <w:tc>
@@ -12409,6 +12472,9 @@
               <w:jc w:val="center"/>
               <w:cnfStyle w:val="000000100000" w:firstRow="0" w:lastRow="0" w:firstColumn="0" w:lastColumn="0" w:oddVBand="0" w:evenVBand="0" w:oddHBand="1" w:evenHBand="0" w:firstRowFirstColumn="0" w:firstRowLastColumn="0" w:lastRowFirstColumn="0" w:lastRowLastColumn="0"/>
             </w:pPr>
+            <w:r>
+              <w:t>tcpdump 4.99.6 + libpcap 1.10.6</w:t>
+            </w:r>
           </w:p>
         </w:tc>
       </w:tr>
@@ -12649,6 +12715,9 @@
               <w:jc w:val="center"/>
               <w:cnfStyle w:val="000000100000" w:firstRow="0" w:lastRow="0" w:firstColumn="0" w:lastColumn="0" w:oddVBand="0" w:evenVBand="0" w:oddHBand="1" w:evenHBand="0" w:firstRowFirstColumn="0" w:firstRowLastColumn="0" w:lastRowFirstColumn="0" w:lastRowLastColumn="0"/>
             </w:pPr>
+            <w:r>
+              <w:t>4.4%</w:t>
+            </w:r>
           </w:p>
         </w:tc>
         <w:tc>
@@ -12661,6 +12730,9 @@
               <w:jc w:val="center"/>
               <w:cnfStyle w:val="000000100000" w:firstRow="0" w:lastRow="0" w:firstColumn="0" w:lastColumn="0" w:oddVBand="0" w:evenVBand="0" w:oddHBand="1" w:evenHBand="0" w:firstRowFirstColumn="0" w:firstRowLastColumn="0" w:lastRowFirstColumn="0" w:lastRowLastColumn="0"/>
             </w:pPr>
+            <w:r>
+              <w:t>FFmpeg 6.1</w:t>
+            </w:r>
           </w:p>
         </w:tc>
       </w:tr>
@@ -12771,6 +12843,9 @@
               <w:jc w:val="center"/>
               <w:cnfStyle w:val="000000010000" w:firstRow="0" w:lastRow="0" w:firstColumn="0" w:lastColumn="0" w:oddVBand="0" w:evenVBand="0" w:oddHBand="0" w:evenHBand="1" w:firstRowFirstColumn="0" w:firstRowLastColumn="0" w:lastRowFirstColumn="0" w:lastRowLastColumn="0"/>
             </w:pPr>
+            <w:r>
+              <w:t>20.3%</w:t>
+            </w:r>
           </w:p>
         </w:tc>
         <w:tc>
@@ -12783,6 +12858,9 @@
               <w:jc w:val="center"/>
               <w:cnfStyle w:val="000000010000" w:firstRow="0" w:lastRow="0" w:firstColumn="0" w:lastColumn="0" w:oddVBand="0" w:evenVBand="0" w:oddHBand="0" w:evenHBand="1" w:firstRowFirstColumn="0" w:firstRowLastColumn="0" w:lastRowFirstColumn="0" w:lastRowLastColumn="0"/>
             </w:pPr>
+            <w:r>
+              <w:t>gdk-pixbuf 2.42.12</w:t>
+            </w:r>
           </w:p>
         </w:tc>
       </w:tr>
@@ -12899,6 +12977,9 @@
               <w:jc w:val="center"/>
               <w:cnfStyle w:val="000000100000" w:firstRow="0" w:lastRow="0" w:firstColumn="0" w:lastColumn="0" w:oddVBand="0" w:evenVBand="0" w:oddHBand="1" w:evenHBand="0" w:firstRowFirstColumn="0" w:firstRowLastColumn="0" w:lastRowFirstColumn="0" w:lastRowLastColumn="0"/>
             </w:pPr>
+            <w:r>
+              <w:t>23.5%</w:t>
+            </w:r>
           </w:p>
         </w:tc>
         <w:tc>
@@ -12911,6 +12992,9 @@
               <w:jc w:val="center"/>
               <w:cnfStyle w:val="000000100000" w:firstRow="0" w:lastRow="0" w:firstColumn="0" w:lastColumn="0" w:oddVBand="0" w:evenVBand="0" w:oddHBand="1" w:evenHBand="0" w:firstRowFirstColumn="0" w:firstRowLastColumn="0" w:lastRowFirstColumn="0" w:lastRowLastColumn="0"/>
             </w:pPr>
+            <w:r>
+              <w:t>giflib 5.2.2 (gif2rgb)</w:t>
+            </w:r>
           </w:p>
         </w:tc>
       </w:tr>
@@ -13018,6 +13102,9 @@
               <w:jc w:val="center"/>
               <w:cnfStyle w:val="000000010000" w:firstRow="0" w:lastRow="0" w:firstColumn="0" w:lastColumn="0" w:oddVBand="0" w:evenVBand="0" w:oddHBand="0" w:evenHBand="1" w:firstRowFirstColumn="0" w:firstRowLastColumn="0" w:lastRowFirstColumn="0" w:lastRowLastColumn="0"/>
             </w:pPr>
+            <w:r>
+              <w:t>14.3%</w:t>
+            </w:r>
           </w:p>
         </w:tc>
         <w:tc>
@@ -13030,6 +13117,9 @@
               <w:jc w:val="center"/>
               <w:cnfStyle w:val="000000010000" w:firstRow="0" w:lastRow="0" w:firstColumn="0" w:lastColumn="0" w:oddVBand="0" w:evenVBand="0" w:oddHBand="0" w:evenHBand="1" w:firstRowFirstColumn="0" w:firstRowLastColumn="0" w:lastRowFirstColumn="0" w:lastRowLastColumn="0"/>
             </w:pPr>
+            <w:r>
+              <w:t>libjpeg-turbo 3.2.0 (djpeg)</w:t>
+            </w:r>
           </w:p>
         </w:tc>
       </w:tr>
@@ -13137,6 +13227,9 @@
               <w:jc w:val="center"/>
               <w:cnfStyle w:val="000000100000" w:firstRow="0" w:lastRow="0" w:firstColumn="0" w:lastColumn="0" w:oddVBand="0" w:evenVBand="0" w:oddHBand="1" w:evenHBand="0" w:firstRowFirstColumn="0" w:firstRowLastColumn="0" w:lastRowFirstColumn="0" w:lastRowLastColumn="0"/>
             </w:pPr>
+            <w:r>
+              <w:t>11.4%</w:t>
+            </w:r>
           </w:p>
         </w:tc>
         <w:tc>
@@ -13149,6 +13242,9 @@
               <w:jc w:val="center"/>
               <w:cnfStyle w:val="000000100000" w:firstRow="0" w:lastRow="0" w:firstColumn="0" w:lastColumn="0" w:oddVBand="0" w:evenVBand="0" w:oddHBand="1" w:evenHBand="0" w:firstRowFirstColumn="0" w:firstRowLastColumn="0" w:lastRowFirstColumn="0" w:lastRowLastColumn="0"/>
             </w:pPr>
+            <w:r>
+              <w:t>TiMidity++ 2.15.0</w:t>
+            </w:r>
           </w:p>
         </w:tc>
       </w:tr>
@@ -13256,6 +13352,9 @@
               <w:jc w:val="center"/>
               <w:cnfStyle w:val="000000010000" w:firstRow="0" w:lastRow="0" w:firstColumn="0" w:lastColumn="0" w:oddVBand="0" w:evenVBand="0" w:oddHBand="0" w:evenHBand="1" w:firstRowFirstColumn="0" w:firstRowLastColumn="0" w:lastRowFirstColumn="0" w:lastRowLastColumn="0"/>
             </w:pPr>
+            <w:r>
+              <w:t>n/a</w:t>
+            </w:r>
           </w:p>
         </w:tc>
         <w:tc>
@@ -13268,6 +13367,9 @@
               <w:jc w:val="center"/>
               <w:cnfStyle w:val="000000010000" w:firstRow="0" w:lastRow="0" w:firstColumn="0" w:lastColumn="0" w:oddVBand="0" w:evenVBand="0" w:oddHBand="0" w:evenHBand="1" w:firstRowFirstColumn="0" w:firstRowLastColumn="0" w:lastRowFirstColumn="0" w:lastRowLastColumn="0"/>
             </w:pPr>
+            <w:r>
+              <w:t>—</w:t>
+            </w:r>
           </w:p>
         </w:tc>
       </w:tr>
@@ -13375,6 +13477,9 @@
               <w:jc w:val="center"/>
               <w:cnfStyle w:val="000000100000" w:firstRow="0" w:lastRow="0" w:firstColumn="0" w:lastColumn="0" w:oddVBand="0" w:evenVBand="0" w:oddHBand="1" w:evenHBand="0" w:firstRowFirstColumn="0" w:firstRowLastColumn="0" w:lastRowFirstColumn="0" w:lastRowLastColumn="0"/>
             </w:pPr>
+            <w:r>
+              <w:t>4.3%</w:t>
+            </w:r>
           </w:p>
         </w:tc>
         <w:tc>
@@ -13387,6 +13492,9 @@
               <w:jc w:val="center"/>
               <w:cnfStyle w:val="000000100000" w:firstRow="0" w:lastRow="0" w:firstColumn="0" w:lastColumn="0" w:oddVBand="0" w:evenVBand="0" w:oddHBand="1" w:evenHBand="0" w:firstRowFirstColumn="0" w:firstRowLastColumn="0" w:lastRowFirstColumn="0" w:lastRowLastColumn="0"/>
             </w:pPr>
+            <w:r>
+              <w:t>FFmpeg 6.1</w:t>
+            </w:r>
           </w:p>
         </w:tc>
       </w:tr>
@@ -13499,6 +13607,9 @@
               <w:jc w:val="center"/>
               <w:cnfStyle w:val="000000010000" w:firstRow="0" w:lastRow="0" w:firstColumn="0" w:lastColumn="0" w:oddVBand="0" w:evenVBand="0" w:oddHBand="0" w:evenHBand="1" w:firstRowFirstColumn="0" w:firstRowLastColumn="0" w:lastRowFirstColumn="0" w:lastRowLastColumn="0"/>
             </w:pPr>
+            <w:r>
+              <w:t>22.3%</w:t>
+            </w:r>
           </w:p>
         </w:tc>
         <w:tc>
@@ -13511,6 +13622,9 @@
               <w:jc w:val="center"/>
               <w:cnfStyle w:val="000000010000" w:firstRow="0" w:lastRow="0" w:firstColumn="0" w:lastColumn="0" w:oddVBand="0" w:evenVBand="0" w:oddHBand="0" w:evenHBand="1" w:firstRowFirstColumn="0" w:firstRowLastColumn="0" w:lastRowFirstColumn="0" w:lastRowLastColumn="0"/>
             </w:pPr>
+            <w:r>
+              <w:t>libpng 1.6.57 (pngtest)</w:t>
+            </w:r>
           </w:p>
         </w:tc>
       </w:tr>
@@ -13618,6 +13732,9 @@
               <w:jc w:val="center"/>
               <w:cnfStyle w:val="000000100000" w:firstRow="0" w:lastRow="0" w:firstColumn="0" w:lastColumn="0" w:oddVBand="0" w:evenVBand="0" w:oddHBand="1" w:evenHBand="0" w:firstRowFirstColumn="0" w:firstRowLastColumn="0" w:lastRowFirstColumn="0" w:lastRowLastColumn="0"/>
             </w:pPr>
+            <w:r>
+              <w:t>22.1%</w:t>
+            </w:r>
           </w:p>
         </w:tc>
         <w:tc>
@@ -13630,6 +13747,9 @@
               <w:jc w:val="center"/>
               <w:cnfStyle w:val="000000100000" w:firstRow="0" w:lastRow="0" w:firstColumn="0" w:lastColumn="0" w:oddVBand="0" w:evenVBand="0" w:oddHBand="1" w:evenHBand="0" w:firstRowFirstColumn="0" w:firstRowLastColumn="0" w:lastRowFirstColumn="0" w:lastRowLastColumn="0"/>
             </w:pPr>
+            <w:r>
+              <w:t>WavPack 5.9.0</w:t>
+            </w:r>
           </w:p>
         </w:tc>
       </w:tr>
@@ -13737,6 +13857,9 @@
               <w:jc w:val="center"/>
               <w:cnfStyle w:val="000000010000" w:firstRow="0" w:lastRow="0" w:firstColumn="0" w:lastColumn="0" w:oddVBand="0" w:evenVBand="0" w:oddHBand="0" w:evenHBand="1" w:firstRowFirstColumn="0" w:firstRowLastColumn="0" w:lastRowFirstColumn="0" w:lastRowLastColumn="0"/>
             </w:pPr>
+            <w:r>
+              <w:t>32.2%</w:t>
+            </w:r>
           </w:p>
         </w:tc>
         <w:tc>
@@ -13749,6 +13872,9 @@
               <w:jc w:val="center"/>
               <w:cnfStyle w:val="000000010000" w:firstRow="0" w:lastRow="0" w:firstColumn="0" w:lastColumn="0" w:oddVBand="0" w:evenVBand="0" w:oddHBand="0" w:evenHBand="1" w:firstRowFirstColumn="0" w:firstRowLastColumn="0" w:lastRowFirstColumn="0" w:lastRowLastColumn="0"/>
             </w:pPr>
+            <w:r>
+              <w:t>Info-ZIP UnZip 6.0</w:t>
+            </w:r>
           </w:p>
         </w:tc>
       </w:tr>
@@ -13858,6 +13984,9 @@
               <w:jc w:val="center"/>
               <w:cnfStyle w:val="000000100000" w:firstRow="0" w:lastRow="0" w:firstColumn="0" w:lastColumn="0" w:oddVBand="0" w:evenVBand="0" w:oddHBand="1" w:evenHBand="0" w:firstRowFirstColumn="0" w:firstRowLastColumn="0" w:lastRowFirstColumn="0" w:lastRowLastColumn="0"/>
             </w:pPr>
+            <w:r>
+              <w:t>5.6%</w:t>
+            </w:r>
           </w:p>
         </w:tc>
         <w:tc>
@@ -13870,6 +13999,9 @@
               <w:jc w:val="center"/>
               <w:cnfStyle w:val="000000100000" w:firstRow="0" w:lastRow="0" w:firstColumn="0" w:lastColumn="0" w:oddVBand="0" w:evenVBand="0" w:oddHBand="1" w:evenHBand="0" w:firstRowFirstColumn="0" w:firstRowLastColumn="0" w:lastRowFirstColumn="0" w:lastRowLastColumn="0"/>
             </w:pPr>
+            <w:r>
+              <w:t>tcpdump 4.99.6 + libpcap 1.10.6</w:t>
+            </w:r>
           </w:p>
         </w:tc>
       </w:tr>
@@ -15316,7 +15448,7 @@
               <w:spacing w:line="360" w:lineRule="auto"/>
             </w:pPr>
             <w:r>
-              <w:t>—</w:t>
+              <w:t>37.1</w:t>
             </w:r>
           </w:p>
         </w:tc>
@@ -15355,7 +15487,7 @@
               <w:spacing w:line="360" w:lineRule="auto"/>
             </w:pPr>
             <w:r>
-              <w:t>—</w:t>
+              <w:t>9.8</w:t>
             </w:r>
           </w:p>
         </w:tc>
@@ -15449,7 +15581,7 @@
         </w:rPr>
       </w:pPr>
       <w:r>
-        <w:t>Line coverage (%) of the target program after an 8-hour AFL+FFMut campaign per format, read from each run's final/meta.json. FF-templates and LLM-templates (Opus 4.7) come from coverage_results_opus4-7_templates/ (runs of 2026-09-01); LLM-templates (Opus 5) from coverage_results/ (runs of 2026-09-07). All supersede the earlier figures invalidated by the shared-gcov defect that pooled the two variants into one set of counters. — = no completed run: midi never produced a snapshot in any set; the Opus 5 set has no png run at all; mp4/FF-templates stopped after 1 h at 6.7%; avi and wav were missing from the Opus 4.7 LLM set. The FF-paper row is a 24-hour, 10-repetition campaign against 2021-era target versions and is not directly comparable to these single 8-hour runs.</w:t>
+        <w:t>Line coverage (%) of the target program after an 8-hour AFL+FFMut campaign per format, read from each run's final/meta.json. FF-templates and LLM-templates (Opus 4.7) come from coverage_results_opus4-7_templates/ (runs of 2026-09-01); LLM-templates (Opus 5) from coverage_results/ (runs of 2026-09-07, with png and midi completed 2026-09-08/09). All supersede the earlier figures invalidated by the shared-gcov defect that pooled the two variants into one set of counters. The Opus 5 row is complete for all ten formats; — marks a run that never completed in the older sets: midi produced no snapshot for FF-templates or Opus 4.7, mp4/FF-templates stopped after 1 h at 6.7%, and avi and wav were absent from the Opus 4.7 LLM set. The FF-paper row is a 24-hour, 10-repetition campaign against 2021-era target versions and is not directly comparable to these single 8-hour runs.</w:t>
       </w:r>
     </w:p>
     <w:p>
@@ -18953,7 +19085,7 @@
                 <w:sz w:val="20"/>
                 <w:szCs w:val="20"/>
               </w:rPr>
-              <w:t>LLM-templates</w:t>
+              <w:t>LLM-templates (Opus 4.7)</w:t>
             </w:r>
           </w:p>
         </w:tc>
@@ -19388,6 +19520,483 @@
                 <w:szCs w:val="20"/>
               </w:rPr>
               <w:t>17.6</w:t>
+            </w:r>
+          </w:p>
+        </w:tc>
+      </w:tr>
+      <w:tr>
+        <w:tc>
+          <w:tcPr>
+            <w:tcW w:w="0" w:type="auto"/>
+            <w:tcBorders>
+              <w:top w:val="single" w:sz="6" w:space="0" w:color="2A2B2C"/>
+              <w:left w:val="single" w:sz="6" w:space="0" w:color="2A2B2C"/>
+              <w:bottom w:val="single" w:sz="6" w:space="0" w:color="2A2B2C"/>
+              <w:right w:val="single" w:sz="6" w:space="0" w:color="2A2B2C"/>
+            </w:tcBorders>
+            <w:shd w:val="clear" w:color="auto" w:fill="191A1B"/>
+            <w:tcMar>
+              <w:top w:w="30" w:type="dxa"/>
+              <w:left w:w="30" w:type="dxa"/>
+              <w:bottom w:w="30" w:type="dxa"/>
+              <w:right w:w="30" w:type="dxa"/>
+            </w:tcMar>
+            <w:vAlign w:val="center"/>
+            <w:hideMark/>
+          </w:tcPr>
+          <w:p>
+            <w:pPr>
+              <w:shd w:val="clear" w:color="auto" w:fill="FFFFFF" w:themeFill="background1"/>
+              <w:spacing w:after="0" w:line="240" w:lineRule="auto"/>
+              <w:rPr>
+                <w:rFonts w:ascii="Segoe UI" w:eastAsia="Times New Roman" w:hAnsi="Segoe UI" w:cs="Segoe UI"/>
+                <w:color w:val="000000" w:themeColor="text1"/>
+                <w:sz w:val="20"/>
+                <w:szCs w:val="20"/>
+              </w:rPr>
+            </w:pPr>
+            <w:r>
+              <w:rPr>
+                <w:rFonts w:ascii="Segoe UI" w:eastAsia="Times New Roman" w:hAnsi="Segoe UI" w:cs="Segoe UI"/>
+                <w:color w:val="000000" w:themeColor="text1"/>
+                <w:sz w:val="20"/>
+                <w:szCs w:val="20"/>
+              </w:rPr>
+              <w:t>LLM-templates (Opus 5)</w:t>
+            </w:r>
+          </w:p>
+        </w:tc>
+        <w:tc>
+          <w:tcPr>
+            <w:tcW w:w="0" w:type="auto"/>
+            <w:tcBorders>
+              <w:top w:val="single" w:sz="6" w:space="0" w:color="2A2B2C"/>
+              <w:left w:val="single" w:sz="6" w:space="0" w:color="2A2B2C"/>
+              <w:bottom w:val="single" w:sz="6" w:space="0" w:color="2A2B2C"/>
+              <w:right w:val="single" w:sz="6" w:space="0" w:color="2A2B2C"/>
+            </w:tcBorders>
+            <w:shd w:val="clear" w:color="auto" w:fill="191A1B"/>
+            <w:tcMar>
+              <w:top w:w="30" w:type="dxa"/>
+              <w:left w:w="30" w:type="dxa"/>
+              <w:bottom w:w="30" w:type="dxa"/>
+              <w:right w:w="30" w:type="dxa"/>
+            </w:tcMar>
+            <w:vAlign w:val="center"/>
+            <w:hideMark/>
+          </w:tcPr>
+          <w:p>
+            <w:pPr>
+              <w:shd w:val="clear" w:color="auto" w:fill="FFFFFF" w:themeFill="background1"/>
+              <w:spacing w:after="0" w:line="240" w:lineRule="auto"/>
+              <w:jc w:val="right"/>
+              <w:rPr>
+                <w:rFonts w:ascii="Segoe UI" w:eastAsia="Times New Roman" w:hAnsi="Segoe UI" w:cs="Segoe UI"/>
+                <w:color w:val="000000" w:themeColor="text1"/>
+                <w:sz w:val="20"/>
+                <w:szCs w:val="20"/>
+              </w:rPr>
+            </w:pPr>
+            <w:r>
+              <w:rPr>
+                <w:rFonts w:ascii="Segoe UI" w:eastAsia="Times New Roman" w:hAnsi="Segoe UI" w:cs="Segoe UI"/>
+                <w:b/>
+                <w:bCs/>
+                <w:color w:val="000000" w:themeColor="text1"/>
+                <w:sz w:val="20"/>
+                <w:szCs w:val="20"/>
+              </w:rPr>
+              <w:t>37.1</w:t>
+            </w:r>
+          </w:p>
+        </w:tc>
+        <w:tc>
+          <w:tcPr>
+            <w:tcW w:w="0" w:type="auto"/>
+            <w:tcBorders>
+              <w:top w:val="single" w:sz="6" w:space="0" w:color="2A2B2C"/>
+              <w:left w:val="single" w:sz="6" w:space="0" w:color="2A2B2C"/>
+              <w:bottom w:val="single" w:sz="6" w:space="0" w:color="2A2B2C"/>
+              <w:right w:val="single" w:sz="6" w:space="0" w:color="2A2B2C"/>
+            </w:tcBorders>
+            <w:shd w:val="clear" w:color="auto" w:fill="191A1B"/>
+            <w:tcMar>
+              <w:top w:w="30" w:type="dxa"/>
+              <w:left w:w="30" w:type="dxa"/>
+              <w:bottom w:w="30" w:type="dxa"/>
+              <w:right w:w="30" w:type="dxa"/>
+            </w:tcMar>
+            <w:vAlign w:val="center"/>
+            <w:hideMark/>
+          </w:tcPr>
+          <w:p>
+            <w:pPr>
+              <w:shd w:val="clear" w:color="auto" w:fill="FFFFFF" w:themeFill="background1"/>
+              <w:spacing w:after="0" w:line="240" w:lineRule="auto"/>
+              <w:jc w:val="right"/>
+              <w:rPr>
+                <w:rFonts w:ascii="Segoe UI" w:eastAsia="Times New Roman" w:hAnsi="Segoe UI" w:cs="Segoe UI"/>
+                <w:color w:val="000000" w:themeColor="text1"/>
+                <w:sz w:val="20"/>
+                <w:szCs w:val="20"/>
+              </w:rPr>
+            </w:pPr>
+            <w:r>
+              <w:rPr>
+                <w:rFonts w:ascii="Segoe UI" w:eastAsia="Times New Roman" w:hAnsi="Segoe UI" w:cs="Segoe UI"/>
+                <w:b/>
+                <w:bCs/>
+                <w:color w:val="000000" w:themeColor="text1"/>
+                <w:sz w:val="20"/>
+                <w:szCs w:val="20"/>
+              </w:rPr>
+              <w:t>19.7</w:t>
+            </w:r>
+          </w:p>
+        </w:tc>
+        <w:tc>
+          <w:tcPr>
+            <w:tcW w:w="0" w:type="auto"/>
+            <w:tcBorders>
+              <w:top w:val="single" w:sz="6" w:space="0" w:color="2A2B2C"/>
+              <w:left w:val="single" w:sz="6" w:space="0" w:color="2A2B2C"/>
+              <w:bottom w:val="single" w:sz="6" w:space="0" w:color="2A2B2C"/>
+              <w:right w:val="single" w:sz="6" w:space="0" w:color="2A2B2C"/>
+            </w:tcBorders>
+            <w:shd w:val="clear" w:color="auto" w:fill="191A1B"/>
+            <w:tcMar>
+              <w:top w:w="30" w:type="dxa"/>
+              <w:left w:w="30" w:type="dxa"/>
+              <w:bottom w:w="30" w:type="dxa"/>
+              <w:right w:w="30" w:type="dxa"/>
+            </w:tcMar>
+            <w:vAlign w:val="center"/>
+            <w:hideMark/>
+          </w:tcPr>
+          <w:p>
+            <w:pPr>
+              <w:shd w:val="clear" w:color="auto" w:fill="FFFFFF" w:themeFill="background1"/>
+              <w:spacing w:after="0" w:line="240" w:lineRule="auto"/>
+              <w:jc w:val="right"/>
+              <w:rPr>
+                <w:rFonts w:ascii="Segoe UI" w:eastAsia="Times New Roman" w:hAnsi="Segoe UI" w:cs="Segoe UI"/>
+                <w:color w:val="000000" w:themeColor="text1"/>
+                <w:sz w:val="20"/>
+                <w:szCs w:val="20"/>
+              </w:rPr>
+            </w:pPr>
+            <w:r>
+              <w:rPr>
+                <w:rFonts w:ascii="Segoe UI" w:eastAsia="Times New Roman" w:hAnsi="Segoe UI" w:cs="Segoe UI"/>
+                <w:b/>
+                <w:bCs/>
+                <w:color w:val="000000" w:themeColor="text1"/>
+                <w:sz w:val="20"/>
+                <w:szCs w:val="20"/>
+              </w:rPr>
+              <w:t>26.8</w:t>
+            </w:r>
+          </w:p>
+        </w:tc>
+        <w:tc>
+          <w:tcPr>
+            <w:tcW w:w="0" w:type="auto"/>
+            <w:tcBorders>
+              <w:top w:val="single" w:sz="6" w:space="0" w:color="2A2B2C"/>
+              <w:left w:val="single" w:sz="6" w:space="0" w:color="2A2B2C"/>
+              <w:bottom w:val="single" w:sz="6" w:space="0" w:color="2A2B2C"/>
+              <w:right w:val="single" w:sz="6" w:space="0" w:color="2A2B2C"/>
+            </w:tcBorders>
+            <w:shd w:val="clear" w:color="auto" w:fill="191A1B"/>
+            <w:tcMar>
+              <w:top w:w="30" w:type="dxa"/>
+              <w:left w:w="30" w:type="dxa"/>
+              <w:bottom w:w="30" w:type="dxa"/>
+              <w:right w:w="30" w:type="dxa"/>
+            </w:tcMar>
+            <w:vAlign w:val="center"/>
+            <w:hideMark/>
+          </w:tcPr>
+          <w:p>
+            <w:pPr>
+              <w:shd w:val="clear" w:color="auto" w:fill="FFFFFF" w:themeFill="background1"/>
+              <w:spacing w:after="0" w:line="240" w:lineRule="auto"/>
+              <w:jc w:val="right"/>
+              <w:rPr>
+                <w:rFonts w:ascii="Segoe UI" w:eastAsia="Times New Roman" w:hAnsi="Segoe UI" w:cs="Segoe UI"/>
+                <w:color w:val="000000" w:themeColor="text1"/>
+                <w:sz w:val="20"/>
+                <w:szCs w:val="20"/>
+              </w:rPr>
+            </w:pPr>
+            <w:r>
+              <w:rPr>
+                <w:rFonts w:ascii="Segoe UI" w:eastAsia="Times New Roman" w:hAnsi="Segoe UI" w:cs="Segoe UI"/>
+                <w:color w:val="000000" w:themeColor="text1"/>
+                <w:sz w:val="20"/>
+                <w:szCs w:val="20"/>
+              </w:rPr>
+              <w:t>9.8</w:t>
+            </w:r>
+          </w:p>
+        </w:tc>
+        <w:tc>
+          <w:tcPr>
+            <w:tcW w:w="0" w:type="auto"/>
+            <w:tcBorders>
+              <w:top w:val="single" w:sz="6" w:space="0" w:color="2A2B2C"/>
+              <w:left w:val="single" w:sz="6" w:space="0" w:color="2A2B2C"/>
+              <w:bottom w:val="single" w:sz="6" w:space="0" w:color="2A2B2C"/>
+              <w:right w:val="single" w:sz="6" w:space="0" w:color="2A2B2C"/>
+            </w:tcBorders>
+            <w:shd w:val="clear" w:color="auto" w:fill="191A1B"/>
+            <w:tcMar>
+              <w:top w:w="30" w:type="dxa"/>
+              <w:left w:w="30" w:type="dxa"/>
+              <w:bottom w:w="30" w:type="dxa"/>
+              <w:right w:w="30" w:type="dxa"/>
+            </w:tcMar>
+            <w:vAlign w:val="center"/>
+            <w:hideMark/>
+          </w:tcPr>
+          <w:p>
+            <w:pPr>
+              <w:shd w:val="clear" w:color="auto" w:fill="FFFFFF" w:themeFill="background1"/>
+              <w:spacing w:after="0" w:line="240" w:lineRule="auto"/>
+              <w:jc w:val="right"/>
+              <w:rPr>
+                <w:rFonts w:ascii="Segoe UI" w:eastAsia="Times New Roman" w:hAnsi="Segoe UI" w:cs="Segoe UI"/>
+                <w:color w:val="000000" w:themeColor="text1"/>
+                <w:sz w:val="20"/>
+                <w:szCs w:val="20"/>
+              </w:rPr>
+            </w:pPr>
+            <w:r>
+              <w:rPr>
+                <w:rFonts w:ascii="Segoe UI" w:eastAsia="Times New Roman" w:hAnsi="Segoe UI" w:cs="Segoe UI"/>
+                <w:b/>
+                <w:bCs/>
+                <w:color w:val="000000" w:themeColor="text1"/>
+                <w:sz w:val="20"/>
+                <w:szCs w:val="20"/>
+              </w:rPr>
+              <w:t>7.1</w:t>
+            </w:r>
+          </w:p>
+        </w:tc>
+        <w:tc>
+          <w:tcPr>
+            <w:tcW w:w="0" w:type="auto"/>
+            <w:tcBorders>
+              <w:top w:val="single" w:sz="6" w:space="0" w:color="2A2B2C"/>
+              <w:left w:val="single" w:sz="6" w:space="0" w:color="2A2B2C"/>
+              <w:bottom w:val="single" w:sz="6" w:space="0" w:color="2A2B2C"/>
+              <w:right w:val="single" w:sz="6" w:space="0" w:color="2A2B2C"/>
+            </w:tcBorders>
+            <w:shd w:val="clear" w:color="auto" w:fill="191A1B"/>
+            <w:tcMar>
+              <w:top w:w="30" w:type="dxa"/>
+              <w:left w:w="30" w:type="dxa"/>
+              <w:bottom w:w="30" w:type="dxa"/>
+              <w:right w:w="30" w:type="dxa"/>
+            </w:tcMar>
+            <w:vAlign w:val="center"/>
+            <w:hideMark/>
+          </w:tcPr>
+          <w:p>
+            <w:pPr>
+              <w:shd w:val="clear" w:color="auto" w:fill="FFFFFF" w:themeFill="background1"/>
+              <w:spacing w:after="0" w:line="240" w:lineRule="auto"/>
+              <w:jc w:val="right"/>
+              <w:rPr>
+                <w:rFonts w:ascii="Segoe UI" w:eastAsia="Times New Roman" w:hAnsi="Segoe UI" w:cs="Segoe UI"/>
+                <w:color w:val="000000" w:themeColor="text1"/>
+                <w:sz w:val="20"/>
+                <w:szCs w:val="20"/>
+              </w:rPr>
+            </w:pPr>
+            <w:r>
+              <w:rPr>
+                <w:rFonts w:ascii="Segoe UI" w:eastAsia="Times New Roman" w:hAnsi="Segoe UI" w:cs="Segoe UI"/>
+                <w:b/>
+                <w:bCs/>
+                <w:color w:val="000000" w:themeColor="text1"/>
+                <w:sz w:val="20"/>
+                <w:szCs w:val="20"/>
+              </w:rPr>
+              <w:t>34.9</w:t>
+            </w:r>
+          </w:p>
+        </w:tc>
+        <w:tc>
+          <w:tcPr>
+            <w:tcW w:w="0" w:type="auto"/>
+            <w:tcBorders>
+              <w:top w:val="single" w:sz="6" w:space="0" w:color="2A2B2C"/>
+              <w:left w:val="single" w:sz="6" w:space="0" w:color="2A2B2C"/>
+              <w:bottom w:val="single" w:sz="6" w:space="0" w:color="2A2B2C"/>
+              <w:right w:val="single" w:sz="6" w:space="0" w:color="2A2B2C"/>
+            </w:tcBorders>
+            <w:shd w:val="clear" w:color="auto" w:fill="191A1B"/>
+            <w:tcMar>
+              <w:top w:w="30" w:type="dxa"/>
+              <w:left w:w="30" w:type="dxa"/>
+              <w:bottom w:w="30" w:type="dxa"/>
+              <w:right w:w="30" w:type="dxa"/>
+            </w:tcMar>
+            <w:vAlign w:val="center"/>
+            <w:hideMark/>
+          </w:tcPr>
+          <w:p>
+            <w:pPr>
+              <w:shd w:val="clear" w:color="auto" w:fill="FFFFFF" w:themeFill="background1"/>
+              <w:spacing w:after="0" w:line="240" w:lineRule="auto"/>
+              <w:jc w:val="right"/>
+              <w:rPr>
+                <w:rFonts w:ascii="Segoe UI" w:eastAsia="Times New Roman" w:hAnsi="Segoe UI" w:cs="Segoe UI"/>
+                <w:color w:val="000000" w:themeColor="text1"/>
+                <w:sz w:val="20"/>
+                <w:szCs w:val="20"/>
+              </w:rPr>
+            </w:pPr>
+            <w:r>
+              <w:rPr>
+                <w:rFonts w:ascii="Segoe UI" w:eastAsia="Times New Roman" w:hAnsi="Segoe UI" w:cs="Segoe UI"/>
+                <w:b/>
+                <w:bCs/>
+                <w:color w:val="000000" w:themeColor="text1"/>
+                <w:sz w:val="20"/>
+                <w:szCs w:val="20"/>
+              </w:rPr>
+              <w:t>13.3</w:t>
+            </w:r>
+          </w:p>
+        </w:tc>
+        <w:tc>
+          <w:tcPr>
+            <w:tcW w:w="0" w:type="auto"/>
+            <w:tcBorders>
+              <w:top w:val="single" w:sz="6" w:space="0" w:color="2A2B2C"/>
+              <w:left w:val="single" w:sz="6" w:space="0" w:color="2A2B2C"/>
+              <w:bottom w:val="single" w:sz="6" w:space="0" w:color="2A2B2C"/>
+              <w:right w:val="single" w:sz="6" w:space="0" w:color="2A2B2C"/>
+            </w:tcBorders>
+            <w:shd w:val="clear" w:color="auto" w:fill="191A1B"/>
+            <w:tcMar>
+              <w:top w:w="30" w:type="dxa"/>
+              <w:left w:w="30" w:type="dxa"/>
+              <w:bottom w:w="30" w:type="dxa"/>
+              <w:right w:w="30" w:type="dxa"/>
+            </w:tcMar>
+            <w:vAlign w:val="center"/>
+            <w:hideMark/>
+          </w:tcPr>
+          <w:p>
+            <w:pPr>
+              <w:shd w:val="clear" w:color="auto" w:fill="FFFFFF" w:themeFill="background1"/>
+              <w:spacing w:after="0" w:line="240" w:lineRule="auto"/>
+              <w:jc w:val="right"/>
+              <w:rPr>
+                <w:rFonts w:ascii="Segoe UI" w:eastAsia="Times New Roman" w:hAnsi="Segoe UI" w:cs="Segoe UI"/>
+                <w:color w:val="000000" w:themeColor="text1"/>
+                <w:sz w:val="20"/>
+                <w:szCs w:val="20"/>
+              </w:rPr>
+            </w:pPr>
+            <w:r>
+              <w:rPr>
+                <w:rFonts w:ascii="Segoe UI" w:eastAsia="Times New Roman" w:hAnsi="Segoe UI" w:cs="Segoe UI"/>
+                <w:color w:val="000000" w:themeColor="text1"/>
+                <w:sz w:val="20"/>
+                <w:szCs w:val="20"/>
+              </w:rPr>
+              <w:t>7.1</w:t>
+            </w:r>
+          </w:p>
+        </w:tc>
+        <w:tc>
+          <w:tcPr>
+            <w:tcW w:w="0" w:type="auto"/>
+            <w:tcBorders>
+              <w:top w:val="single" w:sz="6" w:space="0" w:color="2A2B2C"/>
+              <w:left w:val="single" w:sz="6" w:space="0" w:color="2A2B2C"/>
+              <w:bottom w:val="single" w:sz="6" w:space="0" w:color="2A2B2C"/>
+              <w:right w:val="single" w:sz="6" w:space="0" w:color="2A2B2C"/>
+            </w:tcBorders>
+            <w:shd w:val="clear" w:color="auto" w:fill="191A1B"/>
+            <w:tcMar>
+              <w:top w:w="30" w:type="dxa"/>
+              <w:left w:w="30" w:type="dxa"/>
+              <w:bottom w:w="30" w:type="dxa"/>
+              <w:right w:w="30" w:type="dxa"/>
+            </w:tcMar>
+            <w:vAlign w:val="center"/>
+            <w:hideMark/>
+          </w:tcPr>
+          <w:p>
+            <w:pPr>
+              <w:shd w:val="clear" w:color="auto" w:fill="FFFFFF" w:themeFill="background1"/>
+              <w:spacing w:after="0" w:line="240" w:lineRule="auto"/>
+              <w:jc w:val="right"/>
+              <w:rPr>
+                <w:rFonts w:ascii="Segoe UI" w:eastAsia="Times New Roman" w:hAnsi="Segoe UI" w:cs="Segoe UI"/>
+                <w:color w:val="000000" w:themeColor="text1"/>
+                <w:sz w:val="20"/>
+                <w:szCs w:val="20"/>
+              </w:rPr>
+            </w:pPr>
+            <w:r>
+              <w:rPr>
+                <w:rFonts w:ascii="Segoe UI" w:eastAsia="Times New Roman" w:hAnsi="Segoe UI" w:cs="Segoe UI"/>
+                <w:color w:val="000000" w:themeColor="text1"/>
+                <w:sz w:val="20"/>
+                <w:szCs w:val="20"/>
+              </w:rPr>
+              <w:t>3.0</w:t>
+            </w:r>
+          </w:p>
+        </w:tc>
+        <w:tc>
+          <w:tcPr>
+            <w:tcW w:w="0" w:type="auto"/>
+            <w:tcBorders>
+              <w:top w:val="single" w:sz="6" w:space="0" w:color="2A2B2C"/>
+              <w:left w:val="single" w:sz="6" w:space="0" w:color="2A2B2C"/>
+              <w:bottom w:val="single" w:sz="6" w:space="0" w:color="2A2B2C"/>
+              <w:right w:val="single" w:sz="6" w:space="0" w:color="2A2B2C"/>
+            </w:tcBorders>
+            <w:shd w:val="clear" w:color="auto" w:fill="191A1B"/>
+            <w:tcMar>
+              <w:top w:w="30" w:type="dxa"/>
+              <w:left w:w="30" w:type="dxa"/>
+              <w:bottom w:w="30" w:type="dxa"/>
+              <w:right w:w="30" w:type="dxa"/>
+            </w:tcMar>
+            <w:vAlign w:val="center"/>
+            <w:hideMark/>
+          </w:tcPr>
+          <w:p>
+            <w:pPr>
+              <w:shd w:val="clear" w:color="auto" w:fill="FFFFFF" w:themeFill="background1"/>
+              <w:spacing w:after="0" w:line="240" w:lineRule="auto"/>
+              <w:jc w:val="right"/>
+              <w:rPr>
+                <w:rFonts w:ascii="Segoe UI" w:eastAsia="Times New Roman" w:hAnsi="Segoe UI" w:cs="Segoe UI"/>
+                <w:color w:val="000000" w:themeColor="text1"/>
+                <w:sz w:val="20"/>
+                <w:szCs w:val="20"/>
+              </w:rPr>
+            </w:pPr>
+            <w:r>
+              <w:rPr>
+                <w:rFonts w:ascii="Segoe UI" w:eastAsia="Times New Roman" w:hAnsi="Segoe UI" w:cs="Segoe UI"/>
+                <w:b/>
+                <w:bCs/>
+                <w:color w:val="000000" w:themeColor="text1"/>
+                <w:sz w:val="20"/>
+                <w:szCs w:val="20"/>
+              </w:rPr>
+              <w:t>19.1</w:t>
             </w:r>
           </w:p>
         </w:tc>
@@ -21493,7 +22102,7 @@
                 <w:sz w:val="20"/>
                 <w:szCs w:val="20"/>
               </w:rPr>
-              <w:t>—</w:t>
+              <w:t>37.1</w:t>
             </w:r>
           </w:p>
         </w:tc>
@@ -21625,7 +22234,7 @@
                 <w:sz w:val="20"/>
                 <w:szCs w:val="20"/>
               </w:rPr>
-              <w:t>—</w:t>
+              <w:t>9.8</w:t>
             </w:r>
           </w:p>
         </w:tc>
@@ -21913,70 +22522,12 @@
           <w:sz w:val="20"/>
           <w:szCs w:val="20"/>
         </w:rPr>
-        <w:t xml:space="preserve">Line coverage for the Opus 5 runs (8 h </w:t>
+        <w:t>Line coverage for the Opus 5 runs (8 h AFL+FFMut, read from each run's final/meta.json; eight formats dated 2026-09-07, png 2026-09-08, midi 2026-09-09) — all ten formats now complete:</w:t>
       </w:r>
       <w:proofErr w:type="spellStart"/>
-      <w:r>
-        <w:rPr>
-          <w:rFonts w:ascii="Segoe UI" w:eastAsia="Times New Roman" w:hAnsi="Segoe UI" w:cs="Segoe UI"/>
-          <w:color w:val="000000" w:themeColor="text1"/>
-          <w:sz w:val="20"/>
-          <w:szCs w:val="20"/>
-        </w:rPr>
-        <w:t>AFL+FFMut</w:t>
-      </w:r>
       <w:proofErr w:type="spellEnd"/>
-      <w:r>
-        <w:rPr>
-          <w:rFonts w:ascii="Segoe UI" w:eastAsia="Times New Roman" w:hAnsi="Segoe UI" w:cs="Segoe UI"/>
-          <w:color w:val="000000" w:themeColor="text1"/>
-          <w:sz w:val="20"/>
-          <w:szCs w:val="20"/>
-          <w:shd w:val="clear" w:color="auto" w:fill="FFFFFF" w:themeFill="background1"/>
-        </w:rPr>
-        <w:t xml:space="preserve">, </w:t>
-      </w:r>
-      <w:r>
-        <w:rPr>
-          <w:rFonts w:ascii="Courier New" w:eastAsia="Times New Roman" w:hAnsi="Courier New" w:cs="Courier New"/>
-          <w:color w:val="000000" w:themeColor="text1"/>
-          <w:sz w:val="18"/>
-          <w:szCs w:val="18"/>
-          <w:shd w:val="clear" w:color="auto" w:fill="FFFFFF" w:themeFill="background1"/>
-        </w:rPr>
-        <w:t>final/</w:t>
-      </w:r>
       <w:proofErr w:type="spellStart"/>
-      <w:r>
-        <w:rPr>
-          <w:rFonts w:ascii="Courier New" w:eastAsia="Times New Roman" w:hAnsi="Courier New" w:cs="Courier New"/>
-          <w:color w:val="000000" w:themeColor="text1"/>
-          <w:sz w:val="18"/>
-          <w:szCs w:val="18"/>
-          <w:shd w:val="clear" w:color="auto" w:fill="FFFFFF" w:themeFill="background1"/>
-        </w:rPr>
-        <w:t>meta.json</w:t>
-      </w:r>
       <w:proofErr w:type="spellEnd"/>
-      <w:r>
-        <w:rPr>
-          <w:rFonts w:ascii="Segoe UI" w:eastAsia="Times New Roman" w:hAnsi="Segoe UI" w:cs="Segoe UI"/>
-          <w:color w:val="000000" w:themeColor="text1"/>
-          <w:sz w:val="20"/>
-          <w:szCs w:val="20"/>
-          <w:shd w:val="clear" w:color="auto" w:fill="FFFFFF" w:themeFill="background1"/>
-        </w:rPr>
-        <w:t>, all</w:t>
-      </w:r>
-      <w:r>
-        <w:rPr>
-          <w:rFonts w:ascii="Segoe UI" w:eastAsia="Times New Roman" w:hAnsi="Segoe UI" w:cs="Segoe UI"/>
-          <w:color w:val="000000" w:themeColor="text1"/>
-          <w:sz w:val="20"/>
-          <w:szCs w:val="20"/>
-        </w:rPr>
-        <w:t xml:space="preserve"> dated 2026-09-07):</w:t>
-      </w:r>
     </w:p>
     <w:p>
       <w:pPr>
@@ -22002,37 +22553,10 @@
           <w:sz w:val="20"/>
           <w:szCs w:val="20"/>
         </w:rPr>
-        <w:t>zip</w:t>
-      </w:r>
-      <w:r>
-        <w:rPr>
-          <w:rFonts w:ascii="Segoe UI" w:eastAsia="Times New Roman" w:hAnsi="Segoe UI" w:cs="Segoe UI"/>
-          <w:color w:val="000000" w:themeColor="text1"/>
-          <w:sz w:val="20"/>
-          <w:szCs w:val="20"/>
-        </w:rPr>
-        <w:t xml:space="preserve"> 34.9% — 1727/4944, Info-ZIP </w:t>
+        <w:t>png 37.1% — 4004/10778, libpng 1.6.57 (pngtest)</w:t>
       </w:r>
       <w:proofErr w:type="spellStart"/>
-      <w:r>
-        <w:rPr>
-          <w:rFonts w:ascii="Segoe UI" w:eastAsia="Times New Roman" w:hAnsi="Segoe UI" w:cs="Segoe UI"/>
-          <w:color w:val="000000" w:themeColor="text1"/>
-          <w:sz w:val="20"/>
-          <w:szCs w:val="20"/>
-        </w:rPr>
-        <w:t>UnZip</w:t>
-      </w:r>
       <w:proofErr w:type="spellEnd"/>
-      <w:r>
-        <w:rPr>
-          <w:rFonts w:ascii="Segoe UI" w:eastAsia="Times New Roman" w:hAnsi="Segoe UI" w:cs="Segoe UI"/>
-          <w:color w:val="000000" w:themeColor="text1"/>
-          <w:sz w:val="20"/>
-          <w:szCs w:val="20"/>
-        </w:rPr>
-        <w:t xml:space="preserve"> 6.0</w:t>
-      </w:r>
     </w:p>
     <w:p>
       <w:pPr>
@@ -22058,37 +22582,10 @@
           <w:sz w:val="20"/>
           <w:szCs w:val="20"/>
         </w:rPr>
-        <w:t>gif</w:t>
-      </w:r>
-      <w:r>
-        <w:rPr>
-          <w:rFonts w:ascii="Segoe UI" w:eastAsia="Times New Roman" w:hAnsi="Segoe UI" w:cs="Segoe UI"/>
-          <w:color w:val="000000" w:themeColor="text1"/>
-          <w:sz w:val="20"/>
-          <w:szCs w:val="20"/>
-        </w:rPr>
-        <w:t xml:space="preserve"> 26.8% — 573/2138, </w:t>
+        <w:t>zip 34.9% — 1727/4944, Info-ZIP UnZip 6.0</w:t>
       </w:r>
       <w:proofErr w:type="spellStart"/>
-      <w:r>
-        <w:rPr>
-          <w:rFonts w:ascii="Segoe UI" w:eastAsia="Times New Roman" w:hAnsi="Segoe UI" w:cs="Segoe UI"/>
-          <w:color w:val="000000" w:themeColor="text1"/>
-          <w:sz w:val="20"/>
-          <w:szCs w:val="20"/>
-        </w:rPr>
-        <w:t>giflib</w:t>
-      </w:r>
       <w:proofErr w:type="spellEnd"/>
-      <w:r>
-        <w:rPr>
-          <w:rFonts w:ascii="Segoe UI" w:eastAsia="Times New Roman" w:hAnsi="Segoe UI" w:cs="Segoe UI"/>
-          <w:color w:val="000000" w:themeColor="text1"/>
-          <w:sz w:val="20"/>
-          <w:szCs w:val="20"/>
-        </w:rPr>
-        <w:t xml:space="preserve"> 5.2.2</w:t>
-      </w:r>
     </w:p>
     <w:p>
       <w:pPr>
@@ -22114,37 +22611,10 @@
           <w:sz w:val="20"/>
           <w:szCs w:val="20"/>
         </w:rPr>
-        <w:t>jpg</w:t>
-      </w:r>
-      <w:r>
-        <w:rPr>
-          <w:rFonts w:ascii="Segoe UI" w:eastAsia="Times New Roman" w:hAnsi="Segoe UI" w:cs="Segoe UI"/>
-          <w:color w:val="000000" w:themeColor="text1"/>
-          <w:sz w:val="20"/>
-          <w:szCs w:val="20"/>
-        </w:rPr>
-        <w:t xml:space="preserve"> 19.7% — 3420/17343, </w:t>
+        <w:t>gif 26.8% — 573/2138, giflib 5.2.2</w:t>
       </w:r>
       <w:proofErr w:type="spellStart"/>
-      <w:r>
-        <w:rPr>
-          <w:rFonts w:ascii="Segoe UI" w:eastAsia="Times New Roman" w:hAnsi="Segoe UI" w:cs="Segoe UI"/>
-          <w:color w:val="000000" w:themeColor="text1"/>
-          <w:sz w:val="20"/>
-          <w:szCs w:val="20"/>
-        </w:rPr>
-        <w:t>libjpeg</w:t>
-      </w:r>
       <w:proofErr w:type="spellEnd"/>
-      <w:r>
-        <w:rPr>
-          <w:rFonts w:ascii="Segoe UI" w:eastAsia="Times New Roman" w:hAnsi="Segoe UI" w:cs="Segoe UI"/>
-          <w:color w:val="000000" w:themeColor="text1"/>
-          <w:sz w:val="20"/>
-          <w:szCs w:val="20"/>
-        </w:rPr>
-        <w:t>-turbo 3.2.0</w:t>
-      </w:r>
     </w:p>
     <w:p>
       <w:pPr>
@@ -22170,37 +22640,10 @@
           <w:sz w:val="20"/>
           <w:szCs w:val="20"/>
         </w:rPr>
-        <w:t>bmp</w:t>
-      </w:r>
-      <w:r>
-        <w:rPr>
-          <w:rFonts w:ascii="Segoe UI" w:eastAsia="Times New Roman" w:hAnsi="Segoe UI" w:cs="Segoe UI"/>
-          <w:color w:val="000000" w:themeColor="text1"/>
-          <w:sz w:val="20"/>
-          <w:szCs w:val="20"/>
-        </w:rPr>
-        <w:t xml:space="preserve"> 19.1% — 851/4445, </w:t>
+        <w:t>jpg 19.7% — 3420/17343, libjpeg-turbo 3.2.0</w:t>
       </w:r>
       <w:proofErr w:type="spellStart"/>
-      <w:r>
-        <w:rPr>
-          <w:rFonts w:ascii="Segoe UI" w:eastAsia="Times New Roman" w:hAnsi="Segoe UI" w:cs="Segoe UI"/>
-          <w:color w:val="000000" w:themeColor="text1"/>
-          <w:sz w:val="20"/>
-          <w:szCs w:val="20"/>
-        </w:rPr>
-        <w:t>gdk-pixbuf</w:t>
-      </w:r>
       <w:proofErr w:type="spellEnd"/>
-      <w:r>
-        <w:rPr>
-          <w:rFonts w:ascii="Segoe UI" w:eastAsia="Times New Roman" w:hAnsi="Segoe UI" w:cs="Segoe UI"/>
-          <w:color w:val="000000" w:themeColor="text1"/>
-          <w:sz w:val="20"/>
-          <w:szCs w:val="20"/>
-        </w:rPr>
-        <w:t xml:space="preserve"> 2.42.12</w:t>
-      </w:r>
     </w:p>
     <w:p>
       <w:pPr>
@@ -22227,48 +22670,12 @@
           <w:sz w:val="20"/>
           <w:szCs w:val="20"/>
         </w:rPr>
-        <w:t>pcap</w:t>
+        <w:t>bmp 19.1% — 851/4445, gdk-pixbuf 2.42.12</w:t>
       </w:r>
       <w:proofErr w:type="spellEnd"/>
-      <w:r>
-        <w:rPr>
-          <w:rFonts w:ascii="Segoe UI" w:eastAsia="Times New Roman" w:hAnsi="Segoe UI" w:cs="Segoe UI"/>
-          <w:color w:val="000000" w:themeColor="text1"/>
-          <w:sz w:val="20"/>
-          <w:szCs w:val="20"/>
-        </w:rPr>
-        <w:t xml:space="preserve"> 13.3% — 6363/47822, </w:t>
-      </w:r>
       <w:proofErr w:type="spellStart"/>
-      <w:r>
-        <w:rPr>
-          <w:rFonts w:ascii="Segoe UI" w:eastAsia="Times New Roman" w:hAnsi="Segoe UI" w:cs="Segoe UI"/>
-          <w:color w:val="000000" w:themeColor="text1"/>
-          <w:sz w:val="20"/>
-          <w:szCs w:val="20"/>
-        </w:rPr>
-        <w:t>tcpdump</w:t>
-      </w:r>
       <w:proofErr w:type="spellEnd"/>
-      <w:r>
-        <w:rPr>
-          <w:rFonts w:ascii="Segoe UI" w:eastAsia="Times New Roman" w:hAnsi="Segoe UI" w:cs="Segoe UI"/>
-          <w:color w:val="000000" w:themeColor="text1"/>
-          <w:sz w:val="20"/>
-          <w:szCs w:val="20"/>
-        </w:rPr>
-        <w:t xml:space="preserve"> + </w:t>
-      </w:r>
       <w:proofErr w:type="spellStart"/>
-      <w:r>
-        <w:rPr>
-          <w:rFonts w:ascii="Segoe UI" w:eastAsia="Times New Roman" w:hAnsi="Segoe UI" w:cs="Segoe UI"/>
-          <w:color w:val="000000" w:themeColor="text1"/>
-          <w:sz w:val="20"/>
-          <w:szCs w:val="20"/>
-        </w:rPr>
-        <w:t>libpcap</w:t>
-      </w:r>
       <w:proofErr w:type="spellEnd"/>
     </w:p>
     <w:p>
@@ -22295,37 +22702,10 @@
           <w:sz w:val="20"/>
           <w:szCs w:val="20"/>
         </w:rPr>
-        <w:t>mp4</w:t>
-      </w:r>
-      <w:r>
-        <w:rPr>
-          <w:rFonts w:ascii="Segoe UI" w:eastAsia="Times New Roman" w:hAnsi="Segoe UI" w:cs="Segoe UI"/>
-          <w:color w:val="000000" w:themeColor="text1"/>
-          <w:sz w:val="20"/>
-          <w:szCs w:val="20"/>
-        </w:rPr>
-        <w:t xml:space="preserve"> 7.1% — 33599/471237, </w:t>
+        <w:t>pcap 13.3% — 6363/47822, tcpdump + libpcap</w:t>
       </w:r>
       <w:proofErr w:type="spellStart"/>
-      <w:r>
-        <w:rPr>
-          <w:rFonts w:ascii="Segoe UI" w:eastAsia="Times New Roman" w:hAnsi="Segoe UI" w:cs="Segoe UI"/>
-          <w:color w:val="000000" w:themeColor="text1"/>
-          <w:sz w:val="20"/>
-          <w:szCs w:val="20"/>
-        </w:rPr>
-        <w:t>FFmpeg</w:t>
-      </w:r>
       <w:proofErr w:type="spellEnd"/>
-      <w:r>
-        <w:rPr>
-          <w:rFonts w:ascii="Segoe UI" w:eastAsia="Times New Roman" w:hAnsi="Segoe UI" w:cs="Segoe UI"/>
-          <w:color w:val="000000" w:themeColor="text1"/>
-          <w:sz w:val="20"/>
-          <w:szCs w:val="20"/>
-        </w:rPr>
-        <w:t xml:space="preserve"> 6.1</w:t>
-      </w:r>
     </w:p>
     <w:p>
       <w:pPr>
@@ -22351,37 +22731,10 @@
           <w:sz w:val="20"/>
           <w:szCs w:val="20"/>
         </w:rPr>
-        <w:t>avi</w:t>
-      </w:r>
-      <w:r>
-        <w:rPr>
-          <w:rFonts w:ascii="Segoe UI" w:eastAsia="Times New Roman" w:hAnsi="Segoe UI" w:cs="Segoe UI"/>
-          <w:color w:val="000000" w:themeColor="text1"/>
-          <w:sz w:val="20"/>
-          <w:szCs w:val="20"/>
-        </w:rPr>
-        <w:t xml:space="preserve"> 7.1% — 33391/471237, </w:t>
+        <w:t>midi 9.8% — 2771/28335, TiMidity++ 2.15.0</w:t>
       </w:r>
       <w:proofErr w:type="spellStart"/>
-      <w:r>
-        <w:rPr>
-          <w:rFonts w:ascii="Segoe UI" w:eastAsia="Times New Roman" w:hAnsi="Segoe UI" w:cs="Segoe UI"/>
-          <w:color w:val="000000" w:themeColor="text1"/>
-          <w:sz w:val="20"/>
-          <w:szCs w:val="20"/>
-        </w:rPr>
-        <w:t>FFmpeg</w:t>
-      </w:r>
       <w:proofErr w:type="spellEnd"/>
-      <w:r>
-        <w:rPr>
-          <w:rFonts w:ascii="Segoe UI" w:eastAsia="Times New Roman" w:hAnsi="Segoe UI" w:cs="Segoe UI"/>
-          <w:color w:val="000000" w:themeColor="text1"/>
-          <w:sz w:val="20"/>
-          <w:szCs w:val="20"/>
-        </w:rPr>
-        <w:t xml:space="preserve"> 6.1</w:t>
-      </w:r>
     </w:p>
     <w:p>
       <w:pPr>
@@ -22407,37 +22760,10 @@
           <w:sz w:val="20"/>
           <w:szCs w:val="20"/>
         </w:rPr>
-        <w:t>wav</w:t>
-      </w:r>
-      <w:r>
-        <w:rPr>
-          <w:rFonts w:ascii="Segoe UI" w:eastAsia="Times New Roman" w:hAnsi="Segoe UI" w:cs="Segoe UI"/>
-          <w:color w:val="000000" w:themeColor="text1"/>
-          <w:sz w:val="20"/>
-          <w:szCs w:val="20"/>
-        </w:rPr>
-        <w:t xml:space="preserve"> 3.0% — 303/10197, </w:t>
+        <w:t>mp4 7.1% — 33599/471237, FFmpeg 6.1</w:t>
       </w:r>
       <w:proofErr w:type="spellStart"/>
-      <w:r>
-        <w:rPr>
-          <w:rFonts w:ascii="Segoe UI" w:eastAsia="Times New Roman" w:hAnsi="Segoe UI" w:cs="Segoe UI"/>
-          <w:color w:val="000000" w:themeColor="text1"/>
-          <w:sz w:val="20"/>
-          <w:szCs w:val="20"/>
-        </w:rPr>
-        <w:t>WavPack</w:t>
-      </w:r>
       <w:proofErr w:type="spellEnd"/>
-      <w:r>
-        <w:rPr>
-          <w:rFonts w:ascii="Segoe UI" w:eastAsia="Times New Roman" w:hAnsi="Segoe UI" w:cs="Segoe UI"/>
-          <w:color w:val="000000" w:themeColor="text1"/>
-          <w:sz w:val="20"/>
-          <w:szCs w:val="20"/>
-        </w:rPr>
-        <w:t xml:space="preserve"> 5.9.0</w:t>
-      </w:r>
     </w:p>
     <w:p>
       <w:pPr>
@@ -22463,16 +22789,7 @@
           <w:sz w:val="20"/>
           <w:szCs w:val="20"/>
         </w:rPr>
-        <w:t>midi</w:t>
-      </w:r>
-      <w:r>
-        <w:rPr>
-          <w:rFonts w:ascii="Segoe UI" w:eastAsia="Times New Roman" w:hAnsi="Segoe UI" w:cs="Segoe UI"/>
-          <w:color w:val="000000" w:themeColor="text1"/>
-          <w:sz w:val="20"/>
-          <w:szCs w:val="20"/>
-        </w:rPr>
-        <w:t> — folder exists, zero snapshots</w:t>
+        <w:t>avi 7.1% — 33391/471237, FFmpeg 6.1</w:t>
       </w:r>
     </w:p>
     <w:p>
@@ -22500,20 +22817,2191 @@
           <w:sz w:val="20"/>
           <w:szCs w:val="20"/>
         </w:rPr>
-        <w:t>png</w:t>
+        <w:t>wav 3.0% — 303/10197, WavPack 5.9.0</w:t>
       </w:r>
       <w:proofErr w:type="spellEnd"/>
-      <w:r>
-        <w:rPr>
-          <w:rFonts w:ascii="Segoe UI" w:eastAsia="Times New Roman" w:hAnsi="Segoe UI" w:cs="Segoe UI"/>
-          <w:color w:val="000000" w:themeColor="text1"/>
-          <w:sz w:val="20"/>
-          <w:szCs w:val="20"/>
-        </w:rPr>
-        <w:t> — no run in this set at all</w:t>
-      </w:r>
     </w:p>
     <w:p/>
+    <w:p>
+      <w:pPr>
+        <w:pStyle w:val="Heading1"/>
+      </w:pPr>
+      <w:r>
+        <w:t>AFL + FF-MUT — Opus 4.7 vs Opus 5 (matched re-run, 2026-09-09)</w:t>
+      </w:r>
+    </w:p>
+    <w:p>
+      <w:r>
+        <w:rPr>
+          <w:i/>
+          <w:sz w:val="18"/>
+        </w:rPr>
+        <w:t>A complete, matched head-to-head: all ten formats run for both models, 8-hour AFL+FFMut campaigns (28,800 s), every run completed, launched together on 2026-09-09. Unlike the earlier sets recorded above, each model's templates live in their own directory (templates_llm/llm_opus4.7/&lt;fmt&gt;-llm.bt and templates_llm/llm_opus5/&lt;fmt&gt;-llm.bt), so the two variants are fully isolated. Figures are line and function coverage of the target program, read from each run's final/meta.json. These supersede nothing above — they are a separate, self-contained comparison.</w:t>
+      </w:r>
+    </w:p>
+    <w:p>
+      <w:r>
+        <w:t>Line coverage (%)</w:t>
+      </w:r>
+    </w:p>
+    <w:tbl>
+      <w:tblPr>
+        <w:tblStyle w:val="TableGrid"/>
+        <w:tblW w:type="auto" w:w="0"/>
+        <w:tblLook w:firstColumn="1" w:firstRow="1" w:lastColumn="0" w:lastRow="0" w:noHBand="0" w:noVBand="1" w:val="04A0"/>
+      </w:tblPr>
+      <w:tblGrid>
+        <w:gridCol w:w="785"/>
+        <w:gridCol w:w="785"/>
+        <w:gridCol w:w="785"/>
+        <w:gridCol w:w="785"/>
+        <w:gridCol w:w="785"/>
+        <w:gridCol w:w="785"/>
+        <w:gridCol w:w="785"/>
+        <w:gridCol w:w="785"/>
+        <w:gridCol w:w="785"/>
+        <w:gridCol w:w="785"/>
+        <w:gridCol w:w="785"/>
+      </w:tblGrid>
+      <w:tr>
+        <w:tc>
+          <w:tcPr>
+            <w:tcW w:type="dxa" w:w="785"/>
+          </w:tcPr>
+          <w:p>
+            <w:r>
+              <w:rPr>
+                <w:b/>
+                <w:sz w:val="18"/>
+              </w:rPr>
+              <w:t>Setting</w:t>
+            </w:r>
+          </w:p>
+        </w:tc>
+        <w:tc>
+          <w:tcPr>
+            <w:tcW w:type="dxa" w:w="785"/>
+          </w:tcPr>
+          <w:p>
+            <w:r>
+              <w:rPr>
+                <w:b/>
+                <w:sz w:val="18"/>
+              </w:rPr>
+              <w:t>PNG</w:t>
+            </w:r>
+          </w:p>
+        </w:tc>
+        <w:tc>
+          <w:tcPr>
+            <w:tcW w:type="dxa" w:w="785"/>
+          </w:tcPr>
+          <w:p>
+            <w:r>
+              <w:rPr>
+                <w:b/>
+                <w:sz w:val="18"/>
+              </w:rPr>
+              <w:t>JPG</w:t>
+            </w:r>
+          </w:p>
+        </w:tc>
+        <w:tc>
+          <w:tcPr>
+            <w:tcW w:type="dxa" w:w="785"/>
+          </w:tcPr>
+          <w:p>
+            <w:r>
+              <w:rPr>
+                <w:b/>
+                <w:sz w:val="18"/>
+              </w:rPr>
+              <w:t>GIF</w:t>
+            </w:r>
+          </w:p>
+        </w:tc>
+        <w:tc>
+          <w:tcPr>
+            <w:tcW w:type="dxa" w:w="785"/>
+          </w:tcPr>
+          <w:p>
+            <w:r>
+              <w:rPr>
+                <w:b/>
+                <w:sz w:val="18"/>
+              </w:rPr>
+              <w:t>MIDI</w:t>
+            </w:r>
+          </w:p>
+        </w:tc>
+        <w:tc>
+          <w:tcPr>
+            <w:tcW w:type="dxa" w:w="785"/>
+          </w:tcPr>
+          <w:p>
+            <w:r>
+              <w:rPr>
+                <w:b/>
+                <w:sz w:val="18"/>
+              </w:rPr>
+              <w:t>MP4</w:t>
+            </w:r>
+          </w:p>
+        </w:tc>
+        <w:tc>
+          <w:tcPr>
+            <w:tcW w:type="dxa" w:w="785"/>
+          </w:tcPr>
+          <w:p>
+            <w:r>
+              <w:rPr>
+                <w:b/>
+                <w:sz w:val="18"/>
+              </w:rPr>
+              <w:t>ZIP</w:t>
+            </w:r>
+          </w:p>
+        </w:tc>
+        <w:tc>
+          <w:tcPr>
+            <w:tcW w:type="dxa" w:w="785"/>
+          </w:tcPr>
+          <w:p>
+            <w:r>
+              <w:rPr>
+                <w:b/>
+                <w:sz w:val="18"/>
+              </w:rPr>
+              <w:t>PCAP</w:t>
+            </w:r>
+          </w:p>
+        </w:tc>
+        <w:tc>
+          <w:tcPr>
+            <w:tcW w:type="dxa" w:w="785"/>
+          </w:tcPr>
+          <w:p>
+            <w:r>
+              <w:rPr>
+                <w:b/>
+                <w:sz w:val="18"/>
+              </w:rPr>
+              <w:t>AVI</w:t>
+            </w:r>
+          </w:p>
+        </w:tc>
+        <w:tc>
+          <w:tcPr>
+            <w:tcW w:type="dxa" w:w="785"/>
+          </w:tcPr>
+          <w:p>
+            <w:r>
+              <w:rPr>
+                <w:b/>
+                <w:sz w:val="18"/>
+              </w:rPr>
+              <w:t>WAV</w:t>
+            </w:r>
+          </w:p>
+        </w:tc>
+        <w:tc>
+          <w:tcPr>
+            <w:tcW w:type="dxa" w:w="785"/>
+          </w:tcPr>
+          <w:p>
+            <w:r>
+              <w:rPr>
+                <w:b/>
+                <w:sz w:val="18"/>
+              </w:rPr>
+              <w:t>BMP</w:t>
+            </w:r>
+          </w:p>
+        </w:tc>
+      </w:tr>
+      <w:tr>
+        <w:tc>
+          <w:tcPr>
+            <w:tcW w:type="dxa" w:w="785"/>
+          </w:tcPr>
+          <w:p>
+            <w:r>
+              <w:rPr>
+                <w:b/>
+                <w:sz w:val="18"/>
+              </w:rPr>
+              <w:t>LLM-templates (Opus 4.7)</w:t>
+            </w:r>
+          </w:p>
+        </w:tc>
+        <w:tc>
+          <w:tcPr>
+            <w:tcW w:type="dxa" w:w="785"/>
+          </w:tcPr>
+          <w:p>
+            <w:r>
+              <w:rPr>
+                <w:sz w:val="18"/>
+              </w:rPr>
+              <w:t>35.9</w:t>
+            </w:r>
+          </w:p>
+        </w:tc>
+        <w:tc>
+          <w:tcPr>
+            <w:tcW w:type="dxa" w:w="785"/>
+          </w:tcPr>
+          <w:p>
+            <w:r>
+              <w:rPr>
+                <w:sz w:val="18"/>
+              </w:rPr>
+              <w:t>20.0</w:t>
+            </w:r>
+          </w:p>
+        </w:tc>
+        <w:tc>
+          <w:tcPr>
+            <w:tcW w:type="dxa" w:w="785"/>
+          </w:tcPr>
+          <w:p>
+            <w:r>
+              <w:rPr>
+                <w:sz w:val="18"/>
+              </w:rPr>
+              <w:t>24.6</w:t>
+            </w:r>
+          </w:p>
+        </w:tc>
+        <w:tc>
+          <w:tcPr>
+            <w:tcW w:type="dxa" w:w="785"/>
+          </w:tcPr>
+          <w:p>
+            <w:r>
+              <w:rPr>
+                <w:sz w:val="18"/>
+              </w:rPr>
+              <w:t>9.5</w:t>
+            </w:r>
+          </w:p>
+        </w:tc>
+        <w:tc>
+          <w:tcPr>
+            <w:tcW w:type="dxa" w:w="785"/>
+          </w:tcPr>
+          <w:p>
+            <w:r>
+              <w:rPr>
+                <w:sz w:val="18"/>
+              </w:rPr>
+              <w:t>6.6</w:t>
+            </w:r>
+          </w:p>
+        </w:tc>
+        <w:tc>
+          <w:tcPr>
+            <w:tcW w:type="dxa" w:w="785"/>
+          </w:tcPr>
+          <w:p>
+            <w:r>
+              <w:rPr>
+                <w:sz w:val="18"/>
+              </w:rPr>
+              <w:t>32.2</w:t>
+            </w:r>
+          </w:p>
+        </w:tc>
+        <w:tc>
+          <w:tcPr>
+            <w:tcW w:type="dxa" w:w="785"/>
+          </w:tcPr>
+          <w:p>
+            <w:r>
+              <w:rPr>
+                <w:sz w:val="18"/>
+              </w:rPr>
+              <w:t>6.8</w:t>
+            </w:r>
+          </w:p>
+        </w:tc>
+        <w:tc>
+          <w:tcPr>
+            <w:tcW w:type="dxa" w:w="785"/>
+          </w:tcPr>
+          <w:p>
+            <w:r>
+              <w:rPr>
+                <w:sz w:val="18"/>
+              </w:rPr>
+              <w:t>5.3</w:t>
+            </w:r>
+          </w:p>
+        </w:tc>
+        <w:tc>
+          <w:tcPr>
+            <w:tcW w:type="dxa" w:w="785"/>
+          </w:tcPr>
+          <w:p>
+            <w:r>
+              <w:rPr>
+                <w:sz w:val="18"/>
+              </w:rPr>
+              <w:t>3.0</w:t>
+            </w:r>
+          </w:p>
+        </w:tc>
+        <w:tc>
+          <w:tcPr>
+            <w:tcW w:type="dxa" w:w="785"/>
+          </w:tcPr>
+          <w:p>
+            <w:r>
+              <w:rPr>
+                <w:sz w:val="18"/>
+              </w:rPr>
+              <w:t>16.0</w:t>
+            </w:r>
+          </w:p>
+        </w:tc>
+      </w:tr>
+      <w:tr>
+        <w:tc>
+          <w:tcPr>
+            <w:tcW w:type="dxa" w:w="785"/>
+          </w:tcPr>
+          <w:p>
+            <w:r>
+              <w:rPr>
+                <w:b/>
+                <w:sz w:val="18"/>
+              </w:rPr>
+              <w:t>LLM-templates (Opus 5)</w:t>
+            </w:r>
+          </w:p>
+        </w:tc>
+        <w:tc>
+          <w:tcPr>
+            <w:tcW w:type="dxa" w:w="785"/>
+          </w:tcPr>
+          <w:p>
+            <w:r>
+              <w:rPr>
+                <w:sz w:val="18"/>
+              </w:rPr>
+              <w:t>36.4</w:t>
+            </w:r>
+          </w:p>
+        </w:tc>
+        <w:tc>
+          <w:tcPr>
+            <w:tcW w:type="dxa" w:w="785"/>
+          </w:tcPr>
+          <w:p>
+            <w:r>
+              <w:rPr>
+                <w:sz w:val="18"/>
+              </w:rPr>
+              <w:t>17.0</w:t>
+            </w:r>
+          </w:p>
+        </w:tc>
+        <w:tc>
+          <w:tcPr>
+            <w:tcW w:type="dxa" w:w="785"/>
+          </w:tcPr>
+          <w:p>
+            <w:r>
+              <w:rPr>
+                <w:sz w:val="18"/>
+              </w:rPr>
+              <w:t>26.3</w:t>
+            </w:r>
+          </w:p>
+        </w:tc>
+        <w:tc>
+          <w:tcPr>
+            <w:tcW w:type="dxa" w:w="785"/>
+          </w:tcPr>
+          <w:p>
+            <w:r>
+              <w:rPr>
+                <w:sz w:val="18"/>
+              </w:rPr>
+              <w:t>9.8</w:t>
+            </w:r>
+          </w:p>
+        </w:tc>
+        <w:tc>
+          <w:tcPr>
+            <w:tcW w:type="dxa" w:w="785"/>
+          </w:tcPr>
+          <w:p>
+            <w:r>
+              <w:rPr>
+                <w:sz w:val="18"/>
+              </w:rPr>
+              <w:t>7.0</w:t>
+            </w:r>
+          </w:p>
+        </w:tc>
+        <w:tc>
+          <w:tcPr>
+            <w:tcW w:type="dxa" w:w="785"/>
+          </w:tcPr>
+          <w:p>
+            <w:r>
+              <w:rPr>
+                <w:sz w:val="18"/>
+              </w:rPr>
+              <w:t>34.4</w:t>
+            </w:r>
+          </w:p>
+        </w:tc>
+        <w:tc>
+          <w:tcPr>
+            <w:tcW w:type="dxa" w:w="785"/>
+          </w:tcPr>
+          <w:p>
+            <w:r>
+              <w:rPr>
+                <w:sz w:val="18"/>
+              </w:rPr>
+              <w:t>7.7</w:t>
+            </w:r>
+          </w:p>
+        </w:tc>
+        <w:tc>
+          <w:tcPr>
+            <w:tcW w:type="dxa" w:w="785"/>
+          </w:tcPr>
+          <w:p>
+            <w:r>
+              <w:rPr>
+                <w:sz w:val="18"/>
+              </w:rPr>
+              <w:t>6.7</w:t>
+            </w:r>
+          </w:p>
+        </w:tc>
+        <w:tc>
+          <w:tcPr>
+            <w:tcW w:type="dxa" w:w="785"/>
+          </w:tcPr>
+          <w:p>
+            <w:r>
+              <w:rPr>
+                <w:sz w:val="18"/>
+              </w:rPr>
+              <w:t>3.0</w:t>
+            </w:r>
+          </w:p>
+        </w:tc>
+        <w:tc>
+          <w:tcPr>
+            <w:tcW w:type="dxa" w:w="785"/>
+          </w:tcPr>
+          <w:p>
+            <w:r>
+              <w:rPr>
+                <w:sz w:val="18"/>
+              </w:rPr>
+              <w:t>17.6</w:t>
+            </w:r>
+          </w:p>
+        </w:tc>
+      </w:tr>
+      <w:tr>
+        <w:tc>
+          <w:tcPr>
+            <w:tcW w:type="dxa" w:w="785"/>
+          </w:tcPr>
+          <w:p>
+            <w:r>
+              <w:rPr>
+                <w:b/>
+                <w:sz w:val="18"/>
+              </w:rPr>
+              <w:t>Δ (pts)</w:t>
+            </w:r>
+          </w:p>
+        </w:tc>
+        <w:tc>
+          <w:tcPr>
+            <w:tcW w:type="dxa" w:w="785"/>
+          </w:tcPr>
+          <w:p>
+            <w:r>
+              <w:rPr>
+                <w:sz w:val="18"/>
+              </w:rPr>
+              <w:t>+0.5</w:t>
+            </w:r>
+          </w:p>
+        </w:tc>
+        <w:tc>
+          <w:tcPr>
+            <w:tcW w:type="dxa" w:w="785"/>
+          </w:tcPr>
+          <w:p>
+            <w:r>
+              <w:rPr>
+                <w:sz w:val="18"/>
+              </w:rPr>
+              <w:t>−3.0</w:t>
+            </w:r>
+          </w:p>
+        </w:tc>
+        <w:tc>
+          <w:tcPr>
+            <w:tcW w:type="dxa" w:w="785"/>
+          </w:tcPr>
+          <w:p>
+            <w:r>
+              <w:rPr>
+                <w:sz w:val="18"/>
+              </w:rPr>
+              <w:t>+1.7</w:t>
+            </w:r>
+          </w:p>
+        </w:tc>
+        <w:tc>
+          <w:tcPr>
+            <w:tcW w:type="dxa" w:w="785"/>
+          </w:tcPr>
+          <w:p>
+            <w:r>
+              <w:rPr>
+                <w:sz w:val="18"/>
+              </w:rPr>
+              <w:t>+0.3</w:t>
+            </w:r>
+          </w:p>
+        </w:tc>
+        <w:tc>
+          <w:tcPr>
+            <w:tcW w:type="dxa" w:w="785"/>
+          </w:tcPr>
+          <w:p>
+            <w:r>
+              <w:rPr>
+                <w:sz w:val="18"/>
+              </w:rPr>
+              <w:t>+0.4</w:t>
+            </w:r>
+          </w:p>
+        </w:tc>
+        <w:tc>
+          <w:tcPr>
+            <w:tcW w:type="dxa" w:w="785"/>
+          </w:tcPr>
+          <w:p>
+            <w:r>
+              <w:rPr>
+                <w:sz w:val="18"/>
+              </w:rPr>
+              <w:t>+2.2</w:t>
+            </w:r>
+          </w:p>
+        </w:tc>
+        <w:tc>
+          <w:tcPr>
+            <w:tcW w:type="dxa" w:w="785"/>
+          </w:tcPr>
+          <w:p>
+            <w:r>
+              <w:rPr>
+                <w:sz w:val="18"/>
+              </w:rPr>
+              <w:t>+0.9</w:t>
+            </w:r>
+          </w:p>
+        </w:tc>
+        <w:tc>
+          <w:tcPr>
+            <w:tcW w:type="dxa" w:w="785"/>
+          </w:tcPr>
+          <w:p>
+            <w:r>
+              <w:rPr>
+                <w:sz w:val="18"/>
+              </w:rPr>
+              <w:t>+1.4</w:t>
+            </w:r>
+          </w:p>
+        </w:tc>
+        <w:tc>
+          <w:tcPr>
+            <w:tcW w:type="dxa" w:w="785"/>
+          </w:tcPr>
+          <w:p>
+            <w:r>
+              <w:rPr>
+                <w:sz w:val="18"/>
+              </w:rPr>
+              <w:t>0.0</w:t>
+            </w:r>
+          </w:p>
+        </w:tc>
+        <w:tc>
+          <w:tcPr>
+            <w:tcW w:type="dxa" w:w="785"/>
+          </w:tcPr>
+          <w:p>
+            <w:r>
+              <w:rPr>
+                <w:sz w:val="18"/>
+              </w:rPr>
+              <w:t>+1.6</w:t>
+            </w:r>
+          </w:p>
+        </w:tc>
+      </w:tr>
+    </w:tbl>
+    <w:p>
+      <w:r>
+        <w:t>Function coverage (%)</w:t>
+      </w:r>
+    </w:p>
+    <w:tbl>
+      <w:tblPr>
+        <w:tblStyle w:val="TableGrid"/>
+        <w:tblW w:type="auto" w:w="0"/>
+        <w:tblLook w:firstColumn="1" w:firstRow="1" w:lastColumn="0" w:lastRow="0" w:noHBand="0" w:noVBand="1" w:val="04A0"/>
+      </w:tblPr>
+      <w:tblGrid>
+        <w:gridCol w:w="785"/>
+        <w:gridCol w:w="785"/>
+        <w:gridCol w:w="785"/>
+        <w:gridCol w:w="785"/>
+        <w:gridCol w:w="785"/>
+        <w:gridCol w:w="785"/>
+        <w:gridCol w:w="785"/>
+        <w:gridCol w:w="785"/>
+        <w:gridCol w:w="785"/>
+        <w:gridCol w:w="785"/>
+        <w:gridCol w:w="785"/>
+      </w:tblGrid>
+      <w:tr>
+        <w:tc>
+          <w:tcPr>
+            <w:tcW w:type="dxa" w:w="785"/>
+          </w:tcPr>
+          <w:p>
+            <w:r>
+              <w:rPr>
+                <w:b/>
+                <w:sz w:val="18"/>
+              </w:rPr>
+              <w:t>Setting</w:t>
+            </w:r>
+          </w:p>
+        </w:tc>
+        <w:tc>
+          <w:tcPr>
+            <w:tcW w:type="dxa" w:w="785"/>
+          </w:tcPr>
+          <w:p>
+            <w:r>
+              <w:rPr>
+                <w:b/>
+                <w:sz w:val="18"/>
+              </w:rPr>
+              <w:t>PNG</w:t>
+            </w:r>
+          </w:p>
+        </w:tc>
+        <w:tc>
+          <w:tcPr>
+            <w:tcW w:type="dxa" w:w="785"/>
+          </w:tcPr>
+          <w:p>
+            <w:r>
+              <w:rPr>
+                <w:b/>
+                <w:sz w:val="18"/>
+              </w:rPr>
+              <w:t>JPG</w:t>
+            </w:r>
+          </w:p>
+        </w:tc>
+        <w:tc>
+          <w:tcPr>
+            <w:tcW w:type="dxa" w:w="785"/>
+          </w:tcPr>
+          <w:p>
+            <w:r>
+              <w:rPr>
+                <w:b/>
+                <w:sz w:val="18"/>
+              </w:rPr>
+              <w:t>GIF</w:t>
+            </w:r>
+          </w:p>
+        </w:tc>
+        <w:tc>
+          <w:tcPr>
+            <w:tcW w:type="dxa" w:w="785"/>
+          </w:tcPr>
+          <w:p>
+            <w:r>
+              <w:rPr>
+                <w:b/>
+                <w:sz w:val="18"/>
+              </w:rPr>
+              <w:t>MIDI</w:t>
+            </w:r>
+          </w:p>
+        </w:tc>
+        <w:tc>
+          <w:tcPr>
+            <w:tcW w:type="dxa" w:w="785"/>
+          </w:tcPr>
+          <w:p>
+            <w:r>
+              <w:rPr>
+                <w:b/>
+                <w:sz w:val="18"/>
+              </w:rPr>
+              <w:t>MP4</w:t>
+            </w:r>
+          </w:p>
+        </w:tc>
+        <w:tc>
+          <w:tcPr>
+            <w:tcW w:type="dxa" w:w="785"/>
+          </w:tcPr>
+          <w:p>
+            <w:r>
+              <w:rPr>
+                <w:b/>
+                <w:sz w:val="18"/>
+              </w:rPr>
+              <w:t>ZIP</w:t>
+            </w:r>
+          </w:p>
+        </w:tc>
+        <w:tc>
+          <w:tcPr>
+            <w:tcW w:type="dxa" w:w="785"/>
+          </w:tcPr>
+          <w:p>
+            <w:r>
+              <w:rPr>
+                <w:b/>
+                <w:sz w:val="18"/>
+              </w:rPr>
+              <w:t>PCAP</w:t>
+            </w:r>
+          </w:p>
+        </w:tc>
+        <w:tc>
+          <w:tcPr>
+            <w:tcW w:type="dxa" w:w="785"/>
+          </w:tcPr>
+          <w:p>
+            <w:r>
+              <w:rPr>
+                <w:b/>
+                <w:sz w:val="18"/>
+              </w:rPr>
+              <w:t>AVI</w:t>
+            </w:r>
+          </w:p>
+        </w:tc>
+        <w:tc>
+          <w:tcPr>
+            <w:tcW w:type="dxa" w:w="785"/>
+          </w:tcPr>
+          <w:p>
+            <w:r>
+              <w:rPr>
+                <w:b/>
+                <w:sz w:val="18"/>
+              </w:rPr>
+              <w:t>WAV</w:t>
+            </w:r>
+          </w:p>
+        </w:tc>
+        <w:tc>
+          <w:tcPr>
+            <w:tcW w:type="dxa" w:w="785"/>
+          </w:tcPr>
+          <w:p>
+            <w:r>
+              <w:rPr>
+                <w:b/>
+                <w:sz w:val="18"/>
+              </w:rPr>
+              <w:t>BMP</w:t>
+            </w:r>
+          </w:p>
+        </w:tc>
+      </w:tr>
+      <w:tr>
+        <w:tc>
+          <w:tcPr>
+            <w:tcW w:type="dxa" w:w="785"/>
+          </w:tcPr>
+          <w:p>
+            <w:r>
+              <w:rPr>
+                <w:b/>
+                <w:sz w:val="18"/>
+              </w:rPr>
+              <w:t>LLM-templates (Opus 4.7)</w:t>
+            </w:r>
+          </w:p>
+        </w:tc>
+        <w:tc>
+          <w:tcPr>
+            <w:tcW w:type="dxa" w:w="785"/>
+          </w:tcPr>
+          <w:p>
+            <w:r>
+              <w:rPr>
+                <w:sz w:val="18"/>
+              </w:rPr>
+              <w:t>48.1</w:t>
+            </w:r>
+          </w:p>
+        </w:tc>
+        <w:tc>
+          <w:tcPr>
+            <w:tcW w:type="dxa" w:w="785"/>
+          </w:tcPr>
+          <w:p>
+            <w:r>
+              <w:rPr>
+                <w:sz w:val="18"/>
+              </w:rPr>
+              <w:t>26.3</w:t>
+            </w:r>
+          </w:p>
+        </w:tc>
+        <w:tc>
+          <w:tcPr>
+            <w:tcW w:type="dxa" w:w="785"/>
+          </w:tcPr>
+          <w:p>
+            <w:r>
+              <w:rPr>
+                <w:sz w:val="18"/>
+              </w:rPr>
+              <w:t>34.8</w:t>
+            </w:r>
+          </w:p>
+        </w:tc>
+        <w:tc>
+          <w:tcPr>
+            <w:tcW w:type="dxa" w:w="785"/>
+          </w:tcPr>
+          <w:p>
+            <w:r>
+              <w:rPr>
+                <w:sz w:val="18"/>
+              </w:rPr>
+              <w:t>18.9</w:t>
+            </w:r>
+          </w:p>
+        </w:tc>
+        <w:tc>
+          <w:tcPr>
+            <w:tcW w:type="dxa" w:w="785"/>
+          </w:tcPr>
+          <w:p>
+            <w:r>
+              <w:rPr>
+                <w:sz w:val="18"/>
+              </w:rPr>
+              <w:t>8.1</w:t>
+            </w:r>
+          </w:p>
+        </w:tc>
+        <w:tc>
+          <w:tcPr>
+            <w:tcW w:type="dxa" w:w="785"/>
+          </w:tcPr>
+          <w:p>
+            <w:r>
+              <w:rPr>
+                <w:sz w:val="18"/>
+              </w:rPr>
+              <w:t>55.5</w:t>
+            </w:r>
+          </w:p>
+        </w:tc>
+        <w:tc>
+          <w:tcPr>
+            <w:tcW w:type="dxa" w:w="785"/>
+          </w:tcPr>
+          <w:p>
+            <w:r>
+              <w:rPr>
+                <w:sz w:val="18"/>
+              </w:rPr>
+              <w:t>14.1</w:t>
+            </w:r>
+          </w:p>
+        </w:tc>
+        <w:tc>
+          <w:tcPr>
+            <w:tcW w:type="dxa" w:w="785"/>
+          </w:tcPr>
+          <w:p>
+            <w:r>
+              <w:rPr>
+                <w:sz w:val="18"/>
+              </w:rPr>
+              <w:t>6.1</w:t>
+            </w:r>
+          </w:p>
+        </w:tc>
+        <w:tc>
+          <w:tcPr>
+            <w:tcW w:type="dxa" w:w="785"/>
+          </w:tcPr>
+          <w:p>
+            <w:r>
+              <w:rPr>
+                <w:sz w:val="18"/>
+              </w:rPr>
+              <w:t>7.7</w:t>
+            </w:r>
+          </w:p>
+        </w:tc>
+        <w:tc>
+          <w:tcPr>
+            <w:tcW w:type="dxa" w:w="785"/>
+          </w:tcPr>
+          <w:p>
+            <w:r>
+              <w:rPr>
+                <w:sz w:val="18"/>
+              </w:rPr>
+              <w:t>17.0</w:t>
+            </w:r>
+          </w:p>
+        </w:tc>
+      </w:tr>
+      <w:tr>
+        <w:tc>
+          <w:tcPr>
+            <w:tcW w:type="dxa" w:w="785"/>
+          </w:tcPr>
+          <w:p>
+            <w:r>
+              <w:rPr>
+                <w:b/>
+                <w:sz w:val="18"/>
+              </w:rPr>
+              <w:t>LLM-templates (Opus 5)</w:t>
+            </w:r>
+          </w:p>
+        </w:tc>
+        <w:tc>
+          <w:tcPr>
+            <w:tcW w:type="dxa" w:w="785"/>
+          </w:tcPr>
+          <w:p>
+            <w:r>
+              <w:rPr>
+                <w:sz w:val="18"/>
+              </w:rPr>
+              <w:t>48.1</w:t>
+            </w:r>
+          </w:p>
+        </w:tc>
+        <w:tc>
+          <w:tcPr>
+            <w:tcW w:type="dxa" w:w="785"/>
+          </w:tcPr>
+          <w:p>
+            <w:r>
+              <w:rPr>
+                <w:sz w:val="18"/>
+              </w:rPr>
+              <w:t>22.7</w:t>
+            </w:r>
+          </w:p>
+        </w:tc>
+        <w:tc>
+          <w:tcPr>
+            <w:tcW w:type="dxa" w:w="785"/>
+          </w:tcPr>
+          <w:p>
+            <w:r>
+              <w:rPr>
+                <w:sz w:val="18"/>
+              </w:rPr>
+              <w:t>35.9</w:t>
+            </w:r>
+          </w:p>
+        </w:tc>
+        <w:tc>
+          <w:tcPr>
+            <w:tcW w:type="dxa" w:w="785"/>
+          </w:tcPr>
+          <w:p>
+            <w:r>
+              <w:rPr>
+                <w:sz w:val="18"/>
+              </w:rPr>
+              <w:t>19.1</w:t>
+            </w:r>
+          </w:p>
+        </w:tc>
+        <w:tc>
+          <w:tcPr>
+            <w:tcW w:type="dxa" w:w="785"/>
+          </w:tcPr>
+          <w:p>
+            <w:r>
+              <w:rPr>
+                <w:sz w:val="18"/>
+              </w:rPr>
+              <w:t>8.5</w:t>
+            </w:r>
+          </w:p>
+        </w:tc>
+        <w:tc>
+          <w:tcPr>
+            <w:tcW w:type="dxa" w:w="785"/>
+          </w:tcPr>
+          <w:p>
+            <w:r>
+              <w:rPr>
+                <w:sz w:val="18"/>
+              </w:rPr>
+              <w:t>56.3</w:t>
+            </w:r>
+          </w:p>
+        </w:tc>
+        <w:tc>
+          <w:tcPr>
+            <w:tcW w:type="dxa" w:w="785"/>
+          </w:tcPr>
+          <w:p>
+            <w:r>
+              <w:rPr>
+                <w:sz w:val="18"/>
+              </w:rPr>
+              <w:t>15.5</w:t>
+            </w:r>
+          </w:p>
+        </w:tc>
+        <w:tc>
+          <w:tcPr>
+            <w:tcW w:type="dxa" w:w="785"/>
+          </w:tcPr>
+          <w:p>
+            <w:r>
+              <w:rPr>
+                <w:sz w:val="18"/>
+              </w:rPr>
+              <w:t>7.6</w:t>
+            </w:r>
+          </w:p>
+        </w:tc>
+        <w:tc>
+          <w:tcPr>
+            <w:tcW w:type="dxa" w:w="785"/>
+          </w:tcPr>
+          <w:p>
+            <w:r>
+              <w:rPr>
+                <w:sz w:val="18"/>
+              </w:rPr>
+              <w:t>7.7</w:t>
+            </w:r>
+          </w:p>
+        </w:tc>
+        <w:tc>
+          <w:tcPr>
+            <w:tcW w:type="dxa" w:w="785"/>
+          </w:tcPr>
+          <w:p>
+            <w:r>
+              <w:rPr>
+                <w:sz w:val="18"/>
+              </w:rPr>
+              <w:t>17.7</w:t>
+            </w:r>
+          </w:p>
+        </w:tc>
+      </w:tr>
+      <w:tr>
+        <w:tc>
+          <w:tcPr>
+            <w:tcW w:type="dxa" w:w="785"/>
+          </w:tcPr>
+          <w:p>
+            <w:r>
+              <w:rPr>
+                <w:b/>
+                <w:sz w:val="18"/>
+              </w:rPr>
+              <w:t>Δ (pts)</w:t>
+            </w:r>
+          </w:p>
+        </w:tc>
+        <w:tc>
+          <w:tcPr>
+            <w:tcW w:type="dxa" w:w="785"/>
+          </w:tcPr>
+          <w:p>
+            <w:r>
+              <w:rPr>
+                <w:sz w:val="18"/>
+              </w:rPr>
+              <w:t>0.0</w:t>
+            </w:r>
+          </w:p>
+        </w:tc>
+        <w:tc>
+          <w:tcPr>
+            <w:tcW w:type="dxa" w:w="785"/>
+          </w:tcPr>
+          <w:p>
+            <w:r>
+              <w:rPr>
+                <w:sz w:val="18"/>
+              </w:rPr>
+              <w:t>−3.6</w:t>
+            </w:r>
+          </w:p>
+        </w:tc>
+        <w:tc>
+          <w:tcPr>
+            <w:tcW w:type="dxa" w:w="785"/>
+          </w:tcPr>
+          <w:p>
+            <w:r>
+              <w:rPr>
+                <w:sz w:val="18"/>
+              </w:rPr>
+              <w:t>+1.1</w:t>
+            </w:r>
+          </w:p>
+        </w:tc>
+        <w:tc>
+          <w:tcPr>
+            <w:tcW w:type="dxa" w:w="785"/>
+          </w:tcPr>
+          <w:p>
+            <w:r>
+              <w:rPr>
+                <w:sz w:val="18"/>
+              </w:rPr>
+              <w:t>+0.2</w:t>
+            </w:r>
+          </w:p>
+        </w:tc>
+        <w:tc>
+          <w:tcPr>
+            <w:tcW w:type="dxa" w:w="785"/>
+          </w:tcPr>
+          <w:p>
+            <w:r>
+              <w:rPr>
+                <w:sz w:val="18"/>
+              </w:rPr>
+              <w:t>+0.4</w:t>
+            </w:r>
+          </w:p>
+        </w:tc>
+        <w:tc>
+          <w:tcPr>
+            <w:tcW w:type="dxa" w:w="785"/>
+          </w:tcPr>
+          <w:p>
+            <w:r>
+              <w:rPr>
+                <w:sz w:val="18"/>
+              </w:rPr>
+              <w:t>+0.8</w:t>
+            </w:r>
+          </w:p>
+        </w:tc>
+        <w:tc>
+          <w:tcPr>
+            <w:tcW w:type="dxa" w:w="785"/>
+          </w:tcPr>
+          <w:p>
+            <w:r>
+              <w:rPr>
+                <w:sz w:val="18"/>
+              </w:rPr>
+              <w:t>+1.4</w:t>
+            </w:r>
+          </w:p>
+        </w:tc>
+        <w:tc>
+          <w:tcPr>
+            <w:tcW w:type="dxa" w:w="785"/>
+          </w:tcPr>
+          <w:p>
+            <w:r>
+              <w:rPr>
+                <w:sz w:val="18"/>
+              </w:rPr>
+              <w:t>+1.5</w:t>
+            </w:r>
+          </w:p>
+        </w:tc>
+        <w:tc>
+          <w:tcPr>
+            <w:tcW w:type="dxa" w:w="785"/>
+          </w:tcPr>
+          <w:p>
+            <w:r>
+              <w:rPr>
+                <w:sz w:val="18"/>
+              </w:rPr>
+              <w:t>0.0</w:t>
+            </w:r>
+          </w:p>
+        </w:tc>
+        <w:tc>
+          <w:tcPr>
+            <w:tcW w:type="dxa" w:w="785"/>
+          </w:tcPr>
+          <w:p>
+            <w:r>
+              <w:rPr>
+                <w:sz w:val="18"/>
+              </w:rPr>
+              <w:t>+0.7</w:t>
+            </w:r>
+          </w:p>
+        </w:tc>
+      </w:tr>
+    </w:tbl>
+    <w:p>
+      <w:r>
+        <w:t>Per-format detail</w:t>
+      </w:r>
+    </w:p>
+    <w:tbl>
+      <w:tblPr>
+        <w:tblStyle w:val="TableGrid"/>
+        <w:tblW w:type="auto" w:w="0"/>
+        <w:tblLook w:firstColumn="1" w:firstRow="1" w:lastColumn="0" w:lastRow="0" w:noHBand="0" w:noVBand="1" w:val="04A0"/>
+      </w:tblPr>
+      <w:tblGrid>
+        <w:gridCol w:w="1440"/>
+        <w:gridCol w:w="1440"/>
+        <w:gridCol w:w="1440"/>
+        <w:gridCol w:w="1440"/>
+        <w:gridCol w:w="1440"/>
+        <w:gridCol w:w="1440"/>
+      </w:tblGrid>
+      <w:tr>
+        <w:tc>
+          <w:tcPr>
+            <w:tcW w:type="dxa" w:w="1440"/>
+          </w:tcPr>
+          <w:p>
+            <w:r>
+              <w:rPr>
+                <w:b/>
+                <w:sz w:val="18"/>
+              </w:rPr>
+              <w:t>Format</w:t>
+            </w:r>
+          </w:p>
+        </w:tc>
+        <w:tc>
+          <w:tcPr>
+            <w:tcW w:type="dxa" w:w="1440"/>
+          </w:tcPr>
+          <w:p>
+            <w:r>
+              <w:rPr>
+                <w:b/>
+                <w:sz w:val="18"/>
+              </w:rPr>
+              <w:t>Target program</w:t>
+            </w:r>
+          </w:p>
+        </w:tc>
+        <w:tc>
+          <w:tcPr>
+            <w:tcW w:type="dxa" w:w="1440"/>
+          </w:tcPr>
+          <w:p>
+            <w:r>
+              <w:rPr>
+                <w:b/>
+                <w:sz w:val="18"/>
+              </w:rPr>
+              <w:t>Lines hit / total (Opus 4.7)</w:t>
+            </w:r>
+          </w:p>
+        </w:tc>
+        <w:tc>
+          <w:tcPr>
+            <w:tcW w:type="dxa" w:w="1440"/>
+          </w:tcPr>
+          <w:p>
+            <w:r>
+              <w:rPr>
+                <w:b/>
+                <w:sz w:val="18"/>
+              </w:rPr>
+              <w:t>Lines hit / total (Opus 5)</w:t>
+            </w:r>
+          </w:p>
+        </w:tc>
+        <w:tc>
+          <w:tcPr>
+            <w:tcW w:type="dxa" w:w="1440"/>
+          </w:tcPr>
+          <w:p>
+            <w:r>
+              <w:rPr>
+                <w:b/>
+                <w:sz w:val="18"/>
+              </w:rPr>
+              <w:t>AFL paths 4.7</w:t>
+            </w:r>
+          </w:p>
+        </w:tc>
+        <w:tc>
+          <w:tcPr>
+            <w:tcW w:type="dxa" w:w="1440"/>
+          </w:tcPr>
+          <w:p>
+            <w:r>
+              <w:rPr>
+                <w:b/>
+                <w:sz w:val="18"/>
+              </w:rPr>
+              <w:t>AFL paths 5</w:t>
+            </w:r>
+          </w:p>
+        </w:tc>
+      </w:tr>
+      <w:tr>
+        <w:tc>
+          <w:tcPr>
+            <w:tcW w:type="dxa" w:w="1440"/>
+          </w:tcPr>
+          <w:p>
+            <w:r>
+              <w:rPr>
+                <w:b/>
+                <w:sz w:val="18"/>
+              </w:rPr>
+              <w:t>png</w:t>
+            </w:r>
+          </w:p>
+        </w:tc>
+        <w:tc>
+          <w:tcPr>
+            <w:tcW w:type="dxa" w:w="1440"/>
+          </w:tcPr>
+          <w:p>
+            <w:r>
+              <w:rPr>
+                <w:sz w:val="18"/>
+              </w:rPr>
+              <w:t>libpng 1.6.57 (pngtest)</w:t>
+            </w:r>
+          </w:p>
+        </w:tc>
+        <w:tc>
+          <w:tcPr>
+            <w:tcW w:type="dxa" w:w="1440"/>
+          </w:tcPr>
+          <w:p>
+            <w:r>
+              <w:rPr>
+                <w:sz w:val="18"/>
+              </w:rPr>
+              <w:t>3,872 / 10,778</w:t>
+            </w:r>
+          </w:p>
+        </w:tc>
+        <w:tc>
+          <w:tcPr>
+            <w:tcW w:type="dxa" w:w="1440"/>
+          </w:tcPr>
+          <w:p>
+            <w:r>
+              <w:rPr>
+                <w:sz w:val="18"/>
+              </w:rPr>
+              <w:t>3,923 / 10,778</w:t>
+            </w:r>
+          </w:p>
+        </w:tc>
+        <w:tc>
+          <w:tcPr>
+            <w:tcW w:type="dxa" w:w="1440"/>
+          </w:tcPr>
+          <w:p>
+            <w:r>
+              <w:rPr>
+                <w:sz w:val="18"/>
+              </w:rPr>
+              <w:t>697</w:t>
+            </w:r>
+          </w:p>
+        </w:tc>
+        <w:tc>
+          <w:tcPr>
+            <w:tcW w:type="dxa" w:w="1440"/>
+          </w:tcPr>
+          <w:p>
+            <w:r>
+              <w:rPr>
+                <w:sz w:val="18"/>
+              </w:rPr>
+              <w:t>737</w:t>
+            </w:r>
+          </w:p>
+        </w:tc>
+      </w:tr>
+      <w:tr>
+        <w:tc>
+          <w:tcPr>
+            <w:tcW w:type="dxa" w:w="1440"/>
+          </w:tcPr>
+          <w:p>
+            <w:r>
+              <w:rPr>
+                <w:b/>
+                <w:sz w:val="18"/>
+              </w:rPr>
+              <w:t>jpg</w:t>
+            </w:r>
+          </w:p>
+        </w:tc>
+        <w:tc>
+          <w:tcPr>
+            <w:tcW w:type="dxa" w:w="1440"/>
+          </w:tcPr>
+          <w:p>
+            <w:r>
+              <w:rPr>
+                <w:sz w:val="18"/>
+              </w:rPr>
+              <w:t>libjpeg-turbo 3.2.0 (djpeg)</w:t>
+            </w:r>
+          </w:p>
+        </w:tc>
+        <w:tc>
+          <w:tcPr>
+            <w:tcW w:type="dxa" w:w="1440"/>
+          </w:tcPr>
+          <w:p>
+            <w:r>
+              <w:rPr>
+                <w:sz w:val="18"/>
+              </w:rPr>
+              <w:t>3,466 / 17,343</w:t>
+            </w:r>
+          </w:p>
+        </w:tc>
+        <w:tc>
+          <w:tcPr>
+            <w:tcW w:type="dxa" w:w="1440"/>
+          </w:tcPr>
+          <w:p>
+            <w:r>
+              <w:rPr>
+                <w:sz w:val="18"/>
+              </w:rPr>
+              <w:t>2,950 / 17,343</w:t>
+            </w:r>
+          </w:p>
+        </w:tc>
+        <w:tc>
+          <w:tcPr>
+            <w:tcW w:type="dxa" w:w="1440"/>
+          </w:tcPr>
+          <w:p>
+            <w:r>
+              <w:rPr>
+                <w:sz w:val="18"/>
+              </w:rPr>
+              <w:t>983</w:t>
+            </w:r>
+          </w:p>
+        </w:tc>
+        <w:tc>
+          <w:tcPr>
+            <w:tcW w:type="dxa" w:w="1440"/>
+          </w:tcPr>
+          <w:p>
+            <w:r>
+              <w:rPr>
+                <w:sz w:val="18"/>
+              </w:rPr>
+              <w:t>935</w:t>
+            </w:r>
+          </w:p>
+        </w:tc>
+      </w:tr>
+      <w:tr>
+        <w:tc>
+          <w:tcPr>
+            <w:tcW w:type="dxa" w:w="1440"/>
+          </w:tcPr>
+          <w:p>
+            <w:r>
+              <w:rPr>
+                <w:b/>
+                <w:sz w:val="18"/>
+              </w:rPr>
+              <w:t>gif</w:t>
+            </w:r>
+          </w:p>
+        </w:tc>
+        <w:tc>
+          <w:tcPr>
+            <w:tcW w:type="dxa" w:w="1440"/>
+          </w:tcPr>
+          <w:p>
+            <w:r>
+              <w:rPr>
+                <w:sz w:val="18"/>
+              </w:rPr>
+              <w:t>giflib 5.2.2 (gif2rgb)</w:t>
+            </w:r>
+          </w:p>
+        </w:tc>
+        <w:tc>
+          <w:tcPr>
+            <w:tcW w:type="dxa" w:w="1440"/>
+          </w:tcPr>
+          <w:p>
+            <w:r>
+              <w:rPr>
+                <w:sz w:val="18"/>
+              </w:rPr>
+              <w:t>527 / 2,138</w:t>
+            </w:r>
+          </w:p>
+        </w:tc>
+        <w:tc>
+          <w:tcPr>
+            <w:tcW w:type="dxa" w:w="1440"/>
+          </w:tcPr>
+          <w:p>
+            <w:r>
+              <w:rPr>
+                <w:sz w:val="18"/>
+              </w:rPr>
+              <w:t>562 / 2,138</w:t>
+            </w:r>
+          </w:p>
+        </w:tc>
+        <w:tc>
+          <w:tcPr>
+            <w:tcW w:type="dxa" w:w="1440"/>
+          </w:tcPr>
+          <w:p>
+            <w:r>
+              <w:rPr>
+                <w:sz w:val="18"/>
+              </w:rPr>
+              <w:t>209</w:t>
+            </w:r>
+          </w:p>
+        </w:tc>
+        <w:tc>
+          <w:tcPr>
+            <w:tcW w:type="dxa" w:w="1440"/>
+          </w:tcPr>
+          <w:p>
+            <w:r>
+              <w:rPr>
+                <w:sz w:val="18"/>
+              </w:rPr>
+              <w:t>222</w:t>
+            </w:r>
+          </w:p>
+        </w:tc>
+      </w:tr>
+      <w:tr>
+        <w:tc>
+          <w:tcPr>
+            <w:tcW w:type="dxa" w:w="1440"/>
+          </w:tcPr>
+          <w:p>
+            <w:r>
+              <w:rPr>
+                <w:b/>
+                <w:sz w:val="18"/>
+              </w:rPr>
+              <w:t>midi</w:t>
+            </w:r>
+          </w:p>
+        </w:tc>
+        <w:tc>
+          <w:tcPr>
+            <w:tcW w:type="dxa" w:w="1440"/>
+          </w:tcPr>
+          <w:p>
+            <w:r>
+              <w:rPr>
+                <w:sz w:val="18"/>
+              </w:rPr>
+              <w:t>TiMidity++ 2.15.0</w:t>
+            </w:r>
+          </w:p>
+        </w:tc>
+        <w:tc>
+          <w:tcPr>
+            <w:tcW w:type="dxa" w:w="1440"/>
+          </w:tcPr>
+          <w:p>
+            <w:r>
+              <w:rPr>
+                <w:sz w:val="18"/>
+              </w:rPr>
+              <w:t>2,679 / 28,335</w:t>
+            </w:r>
+          </w:p>
+        </w:tc>
+        <w:tc>
+          <w:tcPr>
+            <w:tcW w:type="dxa" w:w="1440"/>
+          </w:tcPr>
+          <w:p>
+            <w:r>
+              <w:rPr>
+                <w:sz w:val="18"/>
+              </w:rPr>
+              <w:t>2,771 / 28,335</w:t>
+            </w:r>
+          </w:p>
+        </w:tc>
+        <w:tc>
+          <w:tcPr>
+            <w:tcW w:type="dxa" w:w="1440"/>
+          </w:tcPr>
+          <w:p>
+            <w:r>
+              <w:rPr>
+                <w:sz w:val="18"/>
+              </w:rPr>
+              <w:t>124</w:t>
+            </w:r>
+          </w:p>
+        </w:tc>
+        <w:tc>
+          <w:tcPr>
+            <w:tcW w:type="dxa" w:w="1440"/>
+          </w:tcPr>
+          <w:p>
+            <w:r>
+              <w:rPr>
+                <w:sz w:val="18"/>
+              </w:rPr>
+              <w:t>169</w:t>
+            </w:r>
+          </w:p>
+        </w:tc>
+      </w:tr>
+      <w:tr>
+        <w:tc>
+          <w:tcPr>
+            <w:tcW w:type="dxa" w:w="1440"/>
+          </w:tcPr>
+          <w:p>
+            <w:r>
+              <w:rPr>
+                <w:b/>
+                <w:sz w:val="18"/>
+              </w:rPr>
+              <w:t>mp4</w:t>
+            </w:r>
+          </w:p>
+        </w:tc>
+        <w:tc>
+          <w:tcPr>
+            <w:tcW w:type="dxa" w:w="1440"/>
+          </w:tcPr>
+          <w:p>
+            <w:r>
+              <w:rPr>
+                <w:sz w:val="18"/>
+              </w:rPr>
+              <w:t>FFmpeg 6.1</w:t>
+            </w:r>
+          </w:p>
+        </w:tc>
+        <w:tc>
+          <w:tcPr>
+            <w:tcW w:type="dxa" w:w="1440"/>
+          </w:tcPr>
+          <w:p>
+            <w:r>
+              <w:rPr>
+                <w:sz w:val="18"/>
+              </w:rPr>
+              <w:t>30,968 / 471,237</w:t>
+            </w:r>
+          </w:p>
+        </w:tc>
+        <w:tc>
+          <w:tcPr>
+            <w:tcW w:type="dxa" w:w="1440"/>
+          </w:tcPr>
+          <w:p>
+            <w:r>
+              <w:rPr>
+                <w:sz w:val="18"/>
+              </w:rPr>
+              <w:t>33,203 / 471,237</w:t>
+            </w:r>
+          </w:p>
+        </w:tc>
+        <w:tc>
+          <w:tcPr>
+            <w:tcW w:type="dxa" w:w="1440"/>
+          </w:tcPr>
+          <w:p>
+            <w:r>
+              <w:rPr>
+                <w:sz w:val="18"/>
+              </w:rPr>
+              <w:t>4146</w:t>
+            </w:r>
+          </w:p>
+        </w:tc>
+        <w:tc>
+          <w:tcPr>
+            <w:tcW w:type="dxa" w:w="1440"/>
+          </w:tcPr>
+          <w:p>
+            <w:r>
+              <w:rPr>
+                <w:sz w:val="18"/>
+              </w:rPr>
+              <w:t>4080</w:t>
+            </w:r>
+          </w:p>
+        </w:tc>
+      </w:tr>
+      <w:tr>
+        <w:tc>
+          <w:tcPr>
+            <w:tcW w:type="dxa" w:w="1440"/>
+          </w:tcPr>
+          <w:p>
+            <w:r>
+              <w:rPr>
+                <w:b/>
+                <w:sz w:val="18"/>
+              </w:rPr>
+              <w:t>zip</w:t>
+            </w:r>
+          </w:p>
+        </w:tc>
+        <w:tc>
+          <w:tcPr>
+            <w:tcW w:type="dxa" w:w="1440"/>
+          </w:tcPr>
+          <w:p>
+            <w:r>
+              <w:rPr>
+                <w:sz w:val="18"/>
+              </w:rPr>
+              <w:t>Info-ZIP UnZip 6.0</w:t>
+            </w:r>
+          </w:p>
+        </w:tc>
+        <w:tc>
+          <w:tcPr>
+            <w:tcW w:type="dxa" w:w="1440"/>
+          </w:tcPr>
+          <w:p>
+            <w:r>
+              <w:rPr>
+                <w:sz w:val="18"/>
+              </w:rPr>
+              <w:t>1,593 / 4,944</w:t>
+            </w:r>
+          </w:p>
+        </w:tc>
+        <w:tc>
+          <w:tcPr>
+            <w:tcW w:type="dxa" w:w="1440"/>
+          </w:tcPr>
+          <w:p>
+            <w:r>
+              <w:rPr>
+                <w:sz w:val="18"/>
+              </w:rPr>
+              <w:t>1,700 / 4,944</w:t>
+            </w:r>
+          </w:p>
+        </w:tc>
+        <w:tc>
+          <w:tcPr>
+            <w:tcW w:type="dxa" w:w="1440"/>
+          </w:tcPr>
+          <w:p>
+            <w:r>
+              <w:rPr>
+                <w:sz w:val="18"/>
+              </w:rPr>
+              <w:t>744</w:t>
+            </w:r>
+          </w:p>
+        </w:tc>
+        <w:tc>
+          <w:tcPr>
+            <w:tcW w:type="dxa" w:w="1440"/>
+          </w:tcPr>
+          <w:p>
+            <w:r>
+              <w:rPr>
+                <w:sz w:val="18"/>
+              </w:rPr>
+              <w:t>825</w:t>
+            </w:r>
+          </w:p>
+        </w:tc>
+      </w:tr>
+      <w:tr>
+        <w:tc>
+          <w:tcPr>
+            <w:tcW w:type="dxa" w:w="1440"/>
+          </w:tcPr>
+          <w:p>
+            <w:r>
+              <w:rPr>
+                <w:b/>
+                <w:sz w:val="18"/>
+              </w:rPr>
+              <w:t>pcap</w:t>
+            </w:r>
+          </w:p>
+        </w:tc>
+        <w:tc>
+          <w:tcPr>
+            <w:tcW w:type="dxa" w:w="1440"/>
+          </w:tcPr>
+          <w:p>
+            <w:r>
+              <w:rPr>
+                <w:sz w:val="18"/>
+              </w:rPr>
+              <w:t>tcpdump 4.99.6 + libpcap 1.10.6</w:t>
+            </w:r>
+          </w:p>
+        </w:tc>
+        <w:tc>
+          <w:tcPr>
+            <w:tcW w:type="dxa" w:w="1440"/>
+          </w:tcPr>
+          <w:p>
+            <w:r>
+              <w:rPr>
+                <w:sz w:val="18"/>
+              </w:rPr>
+              <w:t>3,236 / 47,822</w:t>
+            </w:r>
+          </w:p>
+        </w:tc>
+        <w:tc>
+          <w:tcPr>
+            <w:tcW w:type="dxa" w:w="1440"/>
+          </w:tcPr>
+          <w:p>
+            <w:r>
+              <w:rPr>
+                <w:sz w:val="18"/>
+              </w:rPr>
+              <w:t>3,684 / 47,822</w:t>
+            </w:r>
+          </w:p>
+        </w:tc>
+        <w:tc>
+          <w:tcPr>
+            <w:tcW w:type="dxa" w:w="1440"/>
+          </w:tcPr>
+          <w:p>
+            <w:r>
+              <w:rPr>
+                <w:sz w:val="18"/>
+              </w:rPr>
+              <w:t>182</w:t>
+            </w:r>
+          </w:p>
+        </w:tc>
+        <w:tc>
+          <w:tcPr>
+            <w:tcW w:type="dxa" w:w="1440"/>
+          </w:tcPr>
+          <w:p>
+            <w:r>
+              <w:rPr>
+                <w:sz w:val="18"/>
+              </w:rPr>
+              <w:t>216</w:t>
+            </w:r>
+          </w:p>
+        </w:tc>
+      </w:tr>
+      <w:tr>
+        <w:tc>
+          <w:tcPr>
+            <w:tcW w:type="dxa" w:w="1440"/>
+          </w:tcPr>
+          <w:p>
+            <w:r>
+              <w:rPr>
+                <w:b/>
+                <w:sz w:val="18"/>
+              </w:rPr>
+              <w:t>avi</w:t>
+            </w:r>
+          </w:p>
+        </w:tc>
+        <w:tc>
+          <w:tcPr>
+            <w:tcW w:type="dxa" w:w="1440"/>
+          </w:tcPr>
+          <w:p>
+            <w:r>
+              <w:rPr>
+                <w:sz w:val="18"/>
+              </w:rPr>
+              <w:t>FFmpeg 6.1</w:t>
+            </w:r>
+          </w:p>
+        </w:tc>
+        <w:tc>
+          <w:tcPr>
+            <w:tcW w:type="dxa" w:w="1440"/>
+          </w:tcPr>
+          <w:p>
+            <w:r>
+              <w:rPr>
+                <w:sz w:val="18"/>
+              </w:rPr>
+              <w:t>25,064 / 471,237</w:t>
+            </w:r>
+          </w:p>
+        </w:tc>
+        <w:tc>
+          <w:tcPr>
+            <w:tcW w:type="dxa" w:w="1440"/>
+          </w:tcPr>
+          <w:p>
+            <w:r>
+              <w:rPr>
+                <w:sz w:val="18"/>
+              </w:rPr>
+              <w:t>31,761 / 471,237</w:t>
+            </w:r>
+          </w:p>
+        </w:tc>
+        <w:tc>
+          <w:tcPr>
+            <w:tcW w:type="dxa" w:w="1440"/>
+          </w:tcPr>
+          <w:p>
+            <w:r>
+              <w:rPr>
+                <w:sz w:val="18"/>
+              </w:rPr>
+              <w:t>976</w:t>
+            </w:r>
+          </w:p>
+        </w:tc>
+        <w:tc>
+          <w:tcPr>
+            <w:tcW w:type="dxa" w:w="1440"/>
+          </w:tcPr>
+          <w:p>
+            <w:r>
+              <w:rPr>
+                <w:sz w:val="18"/>
+              </w:rPr>
+              <w:t>1489</w:t>
+            </w:r>
+          </w:p>
+        </w:tc>
+      </w:tr>
+      <w:tr>
+        <w:tc>
+          <w:tcPr>
+            <w:tcW w:type="dxa" w:w="1440"/>
+          </w:tcPr>
+          <w:p>
+            <w:r>
+              <w:rPr>
+                <w:b/>
+                <w:sz w:val="18"/>
+              </w:rPr>
+              <w:t>wav</w:t>
+            </w:r>
+          </w:p>
+        </w:tc>
+        <w:tc>
+          <w:tcPr>
+            <w:tcW w:type="dxa" w:w="1440"/>
+          </w:tcPr>
+          <w:p>
+            <w:r>
+              <w:rPr>
+                <w:sz w:val="18"/>
+              </w:rPr>
+              <w:t>WavPack 5.9.0</w:t>
+            </w:r>
+          </w:p>
+        </w:tc>
+        <w:tc>
+          <w:tcPr>
+            <w:tcW w:type="dxa" w:w="1440"/>
+          </w:tcPr>
+          <w:p>
+            <w:r>
+              <w:rPr>
+                <w:sz w:val="18"/>
+              </w:rPr>
+              <w:t>303 / 10,197</w:t>
+            </w:r>
+          </w:p>
+        </w:tc>
+        <w:tc>
+          <w:tcPr>
+            <w:tcW w:type="dxa" w:w="1440"/>
+          </w:tcPr>
+          <w:p>
+            <w:r>
+              <w:rPr>
+                <w:sz w:val="18"/>
+              </w:rPr>
+              <w:t>301 / 10,197</w:t>
+            </w:r>
+          </w:p>
+        </w:tc>
+        <w:tc>
+          <w:tcPr>
+            <w:tcW w:type="dxa" w:w="1440"/>
+          </w:tcPr>
+          <w:p>
+            <w:r>
+              <w:rPr>
+                <w:sz w:val="18"/>
+              </w:rPr>
+              <w:t>14</w:t>
+            </w:r>
+          </w:p>
+        </w:tc>
+        <w:tc>
+          <w:tcPr>
+            <w:tcW w:type="dxa" w:w="1440"/>
+          </w:tcPr>
+          <w:p>
+            <w:r>
+              <w:rPr>
+                <w:sz w:val="18"/>
+              </w:rPr>
+              <w:t>14</w:t>
+            </w:r>
+          </w:p>
+        </w:tc>
+      </w:tr>
+      <w:tr>
+        <w:tc>
+          <w:tcPr>
+            <w:tcW w:type="dxa" w:w="1440"/>
+          </w:tcPr>
+          <w:p>
+            <w:r>
+              <w:rPr>
+                <w:b/>
+                <w:sz w:val="18"/>
+              </w:rPr>
+              <w:t>bmp</w:t>
+            </w:r>
+          </w:p>
+        </w:tc>
+        <w:tc>
+          <w:tcPr>
+            <w:tcW w:type="dxa" w:w="1440"/>
+          </w:tcPr>
+          <w:p>
+            <w:r>
+              <w:rPr>
+                <w:sz w:val="18"/>
+              </w:rPr>
+              <w:t>gdk-pixbuf 2.42.12 (custom harness)</w:t>
+            </w:r>
+          </w:p>
+        </w:tc>
+        <w:tc>
+          <w:tcPr>
+            <w:tcW w:type="dxa" w:w="1440"/>
+          </w:tcPr>
+          <w:p>
+            <w:r>
+              <w:rPr>
+                <w:sz w:val="18"/>
+              </w:rPr>
+              <w:t>710 / 4,445</w:t>
+            </w:r>
+          </w:p>
+        </w:tc>
+        <w:tc>
+          <w:tcPr>
+            <w:tcW w:type="dxa" w:w="1440"/>
+          </w:tcPr>
+          <w:p>
+            <w:r>
+              <w:rPr>
+                <w:sz w:val="18"/>
+              </w:rPr>
+              <w:t>783 / 4,445</w:t>
+            </w:r>
+          </w:p>
+        </w:tc>
+        <w:tc>
+          <w:tcPr>
+            <w:tcW w:type="dxa" w:w="1440"/>
+          </w:tcPr>
+          <w:p>
+            <w:r>
+              <w:rPr>
+                <w:sz w:val="18"/>
+              </w:rPr>
+              <w:t>235</w:t>
+            </w:r>
+          </w:p>
+        </w:tc>
+        <w:tc>
+          <w:tcPr>
+            <w:tcW w:type="dxa" w:w="1440"/>
+          </w:tcPr>
+          <w:p>
+            <w:r>
+              <w:rPr>
+                <w:sz w:val="18"/>
+              </w:rPr>
+              <w:t>268</w:t>
+            </w:r>
+          </w:p>
+        </w:tc>
+      </w:tr>
+    </w:tbl>
+    <w:p>
+      <w:r>
+        <w:rPr>
+          <w:i/>
+          <w:sz w:val="18"/>
+        </w:rPr>
+        <w:t>Summary: Opus 5 leads on 8 of the ten formats, trails on 1, and ties the rest, for a mean difference of +0.60 line-coverage points (unweighted across formats). The one clear regression is JPG, where Opus 5 loses 3.0 points (2,950 vs 3,466 lines) and 24 functions. WAV is a tie at 3.0% and is near-dead for both (14 AFL paths in 8 hours). Single runs, no repetitions — differences below roughly a point should be read as noise.</w:t>
+      </w:r>
+    </w:p>
     <w:sectPr>
       <w:pgSz w:w="12240" w:h="15840"/>
       <w:pgMar w:top="1440" w:right="1800" w:bottom="1440" w:left="1800" w:header="720" w:footer="720" w:gutter="0"/>

</xml_diff>

<commit_message>
bug fixes in target coverage
</commit_message>
<xml_diff>
--- a/docs_llm/FormatFuzzer Benchmarking Report.docx
+++ b/docs_llm/FormatFuzzer Benchmarking Report.docx
@@ -12469,7 +12469,28 @@
       <w:pPr>
         <w:pStyle w:val="Heading1"/>
       </w:pPr>
-      <w:r>
+    </w:p>
+    <w:p>
+      <w:pPr>
+        <w:rPr>
+          <w:rFonts w:asciiTheme="majorHAnsi" w:eastAsiaTheme="majorEastAsia" w:hAnsiTheme="majorHAnsi" w:cstheme="majorBidi"/>
+          <w:b/>
+          <w:bCs/>
+          <w:color w:val="365F91" w:themeColor="accent1" w:themeShade="BF"/>
+          <w:sz w:val="28"/>
+          <w:szCs w:val="28"/>
+        </w:rPr>
+      </w:pPr>
+      <w:r>
+        <w:br w:type="page"/>
+      </w:r>
+    </w:p>
+    <w:p>
+      <w:pPr>
+        <w:pStyle w:val="Heading1"/>
+      </w:pPr>
+      <w:r>
+        <w:lastRenderedPageBreak/>
         <w:t>Manually Edited Template Results Table</w:t>
       </w:r>
     </w:p>
@@ -12612,7 +12633,6 @@
               <w:jc w:val="center"/>
             </w:pPr>
             <w:r>
-              <w:lastRenderedPageBreak/>
               <w:t>avi</w:t>
             </w:r>
           </w:p>
@@ -13996,1570 +14016,6 @@
     <w:p/>
     <w:p>
       <w:pPr>
-        <w:pStyle w:val="Heading3"/>
-      </w:pPr>
-      <w:r>
-        <w:t>Coverage</w:t>
-      </w:r>
-    </w:p>
-    <w:p/>
-    <w:tbl>
-      <w:tblPr>
-        <w:tblStyle w:val="TableGrid"/>
-        <w:tblW w:w="0" w:type="auto"/>
-        <w:tblLook w:val="04A0" w:firstRow="1" w:lastRow="0" w:firstColumn="1" w:lastColumn="0" w:noHBand="0" w:noVBand="1"/>
-      </w:tblPr>
-      <w:tblGrid>
-        <w:gridCol w:w="1147"/>
-        <w:gridCol w:w="749"/>
-        <w:gridCol w:w="730"/>
-        <w:gridCol w:w="731"/>
-        <w:gridCol w:w="782"/>
-        <w:gridCol w:w="761"/>
-        <w:gridCol w:w="729"/>
-        <w:gridCol w:w="805"/>
-        <w:gridCol w:w="716"/>
-        <w:gridCol w:w="783"/>
-        <w:gridCol w:w="697"/>
-      </w:tblGrid>
-      <w:tr>
-        <w:tc>
-          <w:tcPr>
-            <w:tcW w:w="705" w:type="dxa"/>
-            <w:shd w:val="clear" w:color="auto" w:fill="B8CCE4" w:themeFill="accent1" w:themeFillTint="66"/>
-          </w:tcPr>
-          <w:p>
-            <w:pPr>
-              <w:spacing w:line="360" w:lineRule="auto"/>
-              <w:rPr>
-                <w:b/>
-                <w:bCs/>
-              </w:rPr>
-            </w:pPr>
-            <w:r>
-              <w:rPr>
-                <w:b/>
-                <w:bCs/>
-              </w:rPr>
-              <w:t>Setting</w:t>
-            </w:r>
-          </w:p>
-        </w:tc>
-        <w:tc>
-          <w:tcPr>
-            <w:tcW w:w="805" w:type="dxa"/>
-            <w:shd w:val="clear" w:color="auto" w:fill="B8CCE4" w:themeFill="accent1" w:themeFillTint="66"/>
-          </w:tcPr>
-          <w:p>
-            <w:pPr>
-              <w:spacing w:line="360" w:lineRule="auto"/>
-              <w:rPr>
-                <w:b/>
-                <w:bCs/>
-              </w:rPr>
-            </w:pPr>
-            <w:r>
-              <w:rPr>
-                <w:b/>
-                <w:bCs/>
-              </w:rPr>
-              <w:t>PNG</w:t>
-            </w:r>
-          </w:p>
-        </w:tc>
-        <w:tc>
-          <w:tcPr>
-            <w:tcW w:w="784" w:type="dxa"/>
-            <w:shd w:val="clear" w:color="auto" w:fill="B8CCE4" w:themeFill="accent1" w:themeFillTint="66"/>
-          </w:tcPr>
-          <w:p>
-            <w:pPr>
-              <w:spacing w:line="360" w:lineRule="auto"/>
-              <w:rPr>
-                <w:b/>
-                <w:bCs/>
-              </w:rPr>
-            </w:pPr>
-            <w:r>
-              <w:rPr>
-                <w:b/>
-                <w:bCs/>
-              </w:rPr>
-              <w:t>JPG</w:t>
-            </w:r>
-          </w:p>
-        </w:tc>
-        <w:tc>
-          <w:tcPr>
-            <w:tcW w:w="784" w:type="dxa"/>
-            <w:shd w:val="clear" w:color="auto" w:fill="B8CCE4" w:themeFill="accent1" w:themeFillTint="66"/>
-          </w:tcPr>
-          <w:p>
-            <w:pPr>
-              <w:spacing w:line="360" w:lineRule="auto"/>
-              <w:rPr>
-                <w:b/>
-                <w:bCs/>
-              </w:rPr>
-            </w:pPr>
-            <w:r>
-              <w:rPr>
-                <w:b/>
-                <w:bCs/>
-              </w:rPr>
-              <w:t>GIF</w:t>
-            </w:r>
-          </w:p>
-        </w:tc>
-        <w:tc>
-          <w:tcPr>
-            <w:tcW w:w="819" w:type="dxa"/>
-            <w:shd w:val="clear" w:color="auto" w:fill="B8CCE4" w:themeFill="accent1" w:themeFillTint="66"/>
-          </w:tcPr>
-          <w:p>
-            <w:pPr>
-              <w:spacing w:line="360" w:lineRule="auto"/>
-              <w:rPr>
-                <w:b/>
-                <w:bCs/>
-              </w:rPr>
-            </w:pPr>
-            <w:r>
-              <w:rPr>
-                <w:b/>
-                <w:bCs/>
-              </w:rPr>
-              <w:t>MIDI</w:t>
-            </w:r>
-          </w:p>
-        </w:tc>
-        <w:tc>
-          <w:tcPr>
-            <w:tcW w:w="809" w:type="dxa"/>
-            <w:shd w:val="clear" w:color="auto" w:fill="B8CCE4" w:themeFill="accent1" w:themeFillTint="66"/>
-          </w:tcPr>
-          <w:p>
-            <w:pPr>
-              <w:spacing w:line="360" w:lineRule="auto"/>
-              <w:rPr>
-                <w:b/>
-                <w:bCs/>
-              </w:rPr>
-            </w:pPr>
-            <w:r>
-              <w:rPr>
-                <w:b/>
-                <w:bCs/>
-              </w:rPr>
-              <w:t>MP4</w:t>
-            </w:r>
-          </w:p>
-        </w:tc>
-        <w:tc>
-          <w:tcPr>
-            <w:tcW w:w="781" w:type="dxa"/>
-            <w:shd w:val="clear" w:color="auto" w:fill="B8CCE4" w:themeFill="accent1" w:themeFillTint="66"/>
-          </w:tcPr>
-          <w:p>
-            <w:pPr>
-              <w:spacing w:line="360" w:lineRule="auto"/>
-              <w:rPr>
-                <w:b/>
-                <w:bCs/>
-              </w:rPr>
-            </w:pPr>
-            <w:r>
-              <w:rPr>
-                <w:b/>
-                <w:bCs/>
-              </w:rPr>
-              <w:t>ZIP</w:t>
-            </w:r>
-          </w:p>
-        </w:tc>
-        <w:tc>
-          <w:tcPr>
-            <w:tcW w:w="830" w:type="dxa"/>
-            <w:shd w:val="clear" w:color="auto" w:fill="B8CCE4" w:themeFill="accent1" w:themeFillTint="66"/>
-          </w:tcPr>
-          <w:p>
-            <w:pPr>
-              <w:spacing w:line="360" w:lineRule="auto"/>
-              <w:rPr>
-                <w:b/>
-                <w:bCs/>
-              </w:rPr>
-            </w:pPr>
-            <w:r>
-              <w:rPr>
-                <w:b/>
-                <w:bCs/>
-              </w:rPr>
-              <w:t>PCAP</w:t>
-            </w:r>
-          </w:p>
-        </w:tc>
-        <w:tc>
-          <w:tcPr>
-            <w:tcW w:w="788" w:type="dxa"/>
-            <w:shd w:val="clear" w:color="auto" w:fill="B8CCE4" w:themeFill="accent1" w:themeFillTint="66"/>
-          </w:tcPr>
-          <w:p>
-            <w:pPr>
-              <w:spacing w:line="360" w:lineRule="auto"/>
-              <w:rPr>
-                <w:b/>
-                <w:bCs/>
-              </w:rPr>
-            </w:pPr>
-            <w:r>
-              <w:rPr>
-                <w:b/>
-                <w:bCs/>
-              </w:rPr>
-              <w:t>AVI</w:t>
-            </w:r>
-          </w:p>
-        </w:tc>
-        <w:tc>
-          <w:tcPr>
-            <w:tcW w:w="820" w:type="dxa"/>
-            <w:shd w:val="clear" w:color="auto" w:fill="B8CCE4" w:themeFill="accent1" w:themeFillTint="66"/>
-          </w:tcPr>
-          <w:p>
-            <w:pPr>
-              <w:spacing w:line="360" w:lineRule="auto"/>
-              <w:rPr>
-                <w:b/>
-                <w:bCs/>
-              </w:rPr>
-            </w:pPr>
-            <w:r>
-              <w:rPr>
-                <w:b/>
-                <w:bCs/>
-              </w:rPr>
-              <w:t>WAV</w:t>
-            </w:r>
-          </w:p>
-        </w:tc>
-        <w:tc>
-          <w:tcPr>
-            <w:tcW w:w="705" w:type="dxa"/>
-            <w:shd w:val="clear" w:color="auto" w:fill="B8CCE4" w:themeFill="accent1" w:themeFillTint="66"/>
-          </w:tcPr>
-          <w:p>
-            <w:pPr>
-              <w:spacing w:line="360" w:lineRule="auto"/>
-              <w:rPr>
-                <w:b/>
-                <w:bCs/>
-              </w:rPr>
-            </w:pPr>
-            <w:r>
-              <w:rPr>
-                <w:b/>
-                <w:bCs/>
-              </w:rPr>
-              <w:t>BMP</w:t>
-            </w:r>
-          </w:p>
-        </w:tc>
-      </w:tr>
-      <w:tr>
-        <w:tc>
-          <w:tcPr>
-            <w:tcW w:w="705" w:type="dxa"/>
-          </w:tcPr>
-          <w:p>
-            <w:pPr>
-              <w:spacing w:line="360" w:lineRule="auto"/>
-            </w:pPr>
-            <w:r>
-              <w:t>FF-paper</w:t>
-            </w:r>
-          </w:p>
-        </w:tc>
-        <w:tc>
-          <w:tcPr>
-            <w:tcW w:w="805" w:type="dxa"/>
-          </w:tcPr>
-          <w:p>
-            <w:pPr>
-              <w:spacing w:line="360" w:lineRule="auto"/>
-            </w:pPr>
-            <w:r>
-              <w:t>23</w:t>
-            </w:r>
-          </w:p>
-        </w:tc>
-        <w:tc>
-          <w:tcPr>
-            <w:tcW w:w="784" w:type="dxa"/>
-          </w:tcPr>
-          <w:p>
-            <w:pPr>
-              <w:spacing w:line="360" w:lineRule="auto"/>
-            </w:pPr>
-            <w:r>
-              <w:t>24.6</w:t>
-            </w:r>
-          </w:p>
-        </w:tc>
-        <w:tc>
-          <w:tcPr>
-            <w:tcW w:w="784" w:type="dxa"/>
-          </w:tcPr>
-          <w:p>
-            <w:pPr>
-              <w:spacing w:line="360" w:lineRule="auto"/>
-            </w:pPr>
-            <w:r>
-              <w:t>68.9</w:t>
-            </w:r>
-          </w:p>
-        </w:tc>
-        <w:tc>
-          <w:tcPr>
-            <w:tcW w:w="819" w:type="dxa"/>
-          </w:tcPr>
-          <w:p>
-            <w:pPr>
-              <w:spacing w:line="360" w:lineRule="auto"/>
-            </w:pPr>
-            <w:r>
-              <w:t>12.4</w:t>
-            </w:r>
-          </w:p>
-        </w:tc>
-        <w:tc>
-          <w:tcPr>
-            <w:tcW w:w="809" w:type="dxa"/>
-          </w:tcPr>
-          <w:p>
-            <w:pPr>
-              <w:spacing w:line="360" w:lineRule="auto"/>
-            </w:pPr>
-            <w:r>
-              <w:t>5.7</w:t>
-            </w:r>
-          </w:p>
-        </w:tc>
-        <w:tc>
-          <w:tcPr>
-            <w:tcW w:w="781" w:type="dxa"/>
-          </w:tcPr>
-          <w:p>
-            <w:pPr>
-              <w:spacing w:line="360" w:lineRule="auto"/>
-            </w:pPr>
-            <w:r>
-              <w:t>34.8</w:t>
-            </w:r>
-          </w:p>
-        </w:tc>
-        <w:tc>
-          <w:tcPr>
-            <w:tcW w:w="830" w:type="dxa"/>
-          </w:tcPr>
-          <w:p>
-            <w:pPr>
-              <w:spacing w:line="360" w:lineRule="auto"/>
-            </w:pPr>
-            <w:r>
-              <w:t>12.5</w:t>
-            </w:r>
-          </w:p>
-        </w:tc>
-        <w:tc>
-          <w:tcPr>
-            <w:tcW w:w="788" w:type="dxa"/>
-          </w:tcPr>
-          <w:p>
-            <w:pPr>
-              <w:spacing w:line="360" w:lineRule="auto"/>
-            </w:pPr>
-            <w:r>
-              <w:t>5.8</w:t>
-            </w:r>
-          </w:p>
-        </w:tc>
-        <w:tc>
-          <w:tcPr>
-            <w:tcW w:w="820" w:type="dxa"/>
-          </w:tcPr>
-          <w:p>
-            <w:pPr>
-              <w:spacing w:line="360" w:lineRule="auto"/>
-            </w:pPr>
-            <w:r>
-              <w:t>21.8</w:t>
-            </w:r>
-          </w:p>
-        </w:tc>
-        <w:tc>
-          <w:tcPr>
-            <w:tcW w:w="705" w:type="dxa"/>
-          </w:tcPr>
-          <w:p>
-            <w:pPr>
-              <w:spacing w:line="360" w:lineRule="auto"/>
-            </w:pPr>
-            <w:r>
-              <w:t>27.8</w:t>
-            </w:r>
-          </w:p>
-        </w:tc>
-      </w:tr>
-      <w:tr>
-        <w:tc>
-          <w:tcPr>
-            <w:tcW w:w="705" w:type="dxa"/>
-          </w:tcPr>
-          <w:p>
-            <w:pPr>
-              <w:spacing w:line="360" w:lineRule="auto"/>
-            </w:pPr>
-            <w:r>
-              <w:t>FF-templates</w:t>
-            </w:r>
-          </w:p>
-        </w:tc>
-        <w:tc>
-          <w:tcPr>
-            <w:tcW w:w="805" w:type="dxa"/>
-          </w:tcPr>
-          <w:p>
-            <w:pPr>
-              <w:spacing w:line="360" w:lineRule="auto"/>
-            </w:pPr>
-            <w:r>
-              <w:t>22.3</w:t>
-            </w:r>
-          </w:p>
-        </w:tc>
-        <w:tc>
-          <w:tcPr>
-            <w:tcW w:w="784" w:type="dxa"/>
-          </w:tcPr>
-          <w:p>
-            <w:pPr>
-              <w:spacing w:line="360" w:lineRule="auto"/>
-            </w:pPr>
-            <w:r>
-              <w:t>14.3</w:t>
-            </w:r>
-          </w:p>
-        </w:tc>
-        <w:tc>
-          <w:tcPr>
-            <w:tcW w:w="784" w:type="dxa"/>
-          </w:tcPr>
-          <w:p>
-            <w:pPr>
-              <w:spacing w:line="360" w:lineRule="auto"/>
-            </w:pPr>
-            <w:r>
-              <w:t>23.5</w:t>
-            </w:r>
-          </w:p>
-        </w:tc>
-        <w:tc>
-          <w:tcPr>
-            <w:tcW w:w="819" w:type="dxa"/>
-          </w:tcPr>
-          <w:p>
-            <w:pPr>
-              <w:spacing w:line="360" w:lineRule="auto"/>
-            </w:pPr>
-            <w:r>
-              <w:t>11.4</w:t>
-            </w:r>
-          </w:p>
-        </w:tc>
-        <w:tc>
-          <w:tcPr>
-            <w:tcW w:w="809" w:type="dxa"/>
-          </w:tcPr>
-          <w:p>
-            <w:pPr>
-              <w:spacing w:line="360" w:lineRule="auto"/>
-            </w:pPr>
-            <w:r>
-              <w:t>4.3</w:t>
-            </w:r>
-          </w:p>
-        </w:tc>
-        <w:tc>
-          <w:tcPr>
-            <w:tcW w:w="781" w:type="dxa"/>
-          </w:tcPr>
-          <w:p>
-            <w:pPr>
-              <w:spacing w:line="360" w:lineRule="auto"/>
-            </w:pPr>
-            <w:r>
-              <w:t>32.2</w:t>
-            </w:r>
-          </w:p>
-        </w:tc>
-        <w:tc>
-          <w:tcPr>
-            <w:tcW w:w="830" w:type="dxa"/>
-          </w:tcPr>
-          <w:p>
-            <w:pPr>
-              <w:spacing w:line="360" w:lineRule="auto"/>
-            </w:pPr>
-            <w:r>
-              <w:t>5.6</w:t>
-            </w:r>
-          </w:p>
-        </w:tc>
-        <w:tc>
-          <w:tcPr>
-            <w:tcW w:w="788" w:type="dxa"/>
-          </w:tcPr>
-          <w:p>
-            <w:pPr>
-              <w:spacing w:line="360" w:lineRule="auto"/>
-            </w:pPr>
-            <w:r>
-              <w:t>4.4</w:t>
-            </w:r>
-          </w:p>
-        </w:tc>
-        <w:tc>
-          <w:tcPr>
-            <w:tcW w:w="820" w:type="dxa"/>
-          </w:tcPr>
-          <w:p>
-            <w:pPr>
-              <w:spacing w:line="360" w:lineRule="auto"/>
-            </w:pPr>
-            <w:r>
-              <w:t>22.1</w:t>
-            </w:r>
-          </w:p>
-        </w:tc>
-        <w:tc>
-          <w:tcPr>
-            <w:tcW w:w="705" w:type="dxa"/>
-          </w:tcPr>
-          <w:p>
-            <w:pPr>
-              <w:spacing w:line="360" w:lineRule="auto"/>
-            </w:pPr>
-            <w:r>
-              <w:t>20.3</w:t>
-            </w:r>
-          </w:p>
-        </w:tc>
-      </w:tr>
-      <w:tr>
-        <w:tc>
-          <w:tcPr>
-            <w:tcW w:w="705" w:type="dxa"/>
-          </w:tcPr>
-          <w:p>
-            <w:pPr>
-              <w:spacing w:line="360" w:lineRule="auto"/>
-            </w:pPr>
-            <w:r>
-              <w:lastRenderedPageBreak/>
-              <w:t>LLM-templates</w:t>
-            </w:r>
-          </w:p>
-        </w:tc>
-        <w:tc>
-          <w:tcPr>
-            <w:tcW w:w="805" w:type="dxa"/>
-          </w:tcPr>
-          <w:p>
-            <w:pPr>
-              <w:spacing w:line="360" w:lineRule="auto"/>
-            </w:pPr>
-            <w:r>
-              <w:t>21.8</w:t>
-            </w:r>
-          </w:p>
-        </w:tc>
-        <w:tc>
-          <w:tcPr>
-            <w:tcW w:w="784" w:type="dxa"/>
-          </w:tcPr>
-          <w:p>
-            <w:pPr>
-              <w:spacing w:line="360" w:lineRule="auto"/>
-            </w:pPr>
-            <w:r>
-              <w:t>9.8</w:t>
-            </w:r>
-          </w:p>
-        </w:tc>
-        <w:tc>
-          <w:tcPr>
-            <w:tcW w:w="784" w:type="dxa"/>
-          </w:tcPr>
-          <w:p>
-            <w:pPr>
-              <w:spacing w:line="360" w:lineRule="auto"/>
-            </w:pPr>
-            <w:r>
-              <w:t>24.5</w:t>
-            </w:r>
-          </w:p>
-        </w:tc>
-        <w:tc>
-          <w:tcPr>
-            <w:tcW w:w="819" w:type="dxa"/>
-          </w:tcPr>
-          <w:p>
-            <w:pPr>
-              <w:spacing w:line="360" w:lineRule="auto"/>
-            </w:pPr>
-            <w:r>
-              <w:t>8.4</w:t>
-            </w:r>
-          </w:p>
-        </w:tc>
-        <w:tc>
-          <w:tcPr>
-            <w:tcW w:w="809" w:type="dxa"/>
-          </w:tcPr>
-          <w:p>
-            <w:pPr>
-              <w:spacing w:line="360" w:lineRule="auto"/>
-            </w:pPr>
-            <w:r>
-              <w:t>1.6</w:t>
-            </w:r>
-          </w:p>
-        </w:tc>
-        <w:tc>
-          <w:tcPr>
-            <w:tcW w:w="781" w:type="dxa"/>
-          </w:tcPr>
-          <w:p>
-            <w:pPr>
-              <w:spacing w:line="360" w:lineRule="auto"/>
-            </w:pPr>
-            <w:r>
-              <w:t>15.1</w:t>
-            </w:r>
-          </w:p>
-        </w:tc>
-        <w:tc>
-          <w:tcPr>
-            <w:tcW w:w="830" w:type="dxa"/>
-          </w:tcPr>
-          <w:p>
-            <w:pPr>
-              <w:spacing w:line="360" w:lineRule="auto"/>
-            </w:pPr>
-            <w:r>
-              <w:t>4.5</w:t>
-            </w:r>
-          </w:p>
-        </w:tc>
-        <w:tc>
-          <w:tcPr>
-            <w:tcW w:w="788" w:type="dxa"/>
-          </w:tcPr>
-          <w:p>
-            <w:pPr>
-              <w:spacing w:line="360" w:lineRule="auto"/>
-            </w:pPr>
-            <w:r>
-              <w:t>3.5</w:t>
-            </w:r>
-          </w:p>
-        </w:tc>
-        <w:tc>
-          <w:tcPr>
-            <w:tcW w:w="820" w:type="dxa"/>
-          </w:tcPr>
-          <w:p>
-            <w:pPr>
-              <w:spacing w:line="360" w:lineRule="auto"/>
-            </w:pPr>
-            <w:r>
-              <w:t>22</w:t>
-            </w:r>
-          </w:p>
-        </w:tc>
-        <w:tc>
-          <w:tcPr>
-            <w:tcW w:w="705" w:type="dxa"/>
-          </w:tcPr>
-          <w:p>
-            <w:pPr>
-              <w:spacing w:line="360" w:lineRule="auto"/>
-            </w:pPr>
-            <w:r>
-              <w:t>14.5</w:t>
-            </w:r>
-          </w:p>
-        </w:tc>
-      </w:tr>
-    </w:tbl>
-    <w:p/>
-    <w:p/>
-    <w:p>
-      <w:pPr>
-        <w:pStyle w:val="Heading3"/>
-      </w:pPr>
-      <w:r>
-        <w:t>Coverage AFL + FF-MUT</w:t>
-      </w:r>
-    </w:p>
-    <w:p/>
-    <w:tbl>
-      <w:tblPr>
-        <w:tblStyle w:val="TableGrid"/>
-        <w:tblW w:w="0" w:type="auto"/>
-        <w:tblLook w:val="04A0" w:firstRow="1" w:lastRow="0" w:firstColumn="1" w:lastColumn="0" w:noHBand="0" w:noVBand="1"/>
-      </w:tblPr>
-      <w:tblGrid>
-        <w:gridCol w:w="1148"/>
-        <w:gridCol w:w="748"/>
-        <w:gridCol w:w="728"/>
-        <w:gridCol w:w="728"/>
-        <w:gridCol w:w="781"/>
-        <w:gridCol w:w="759"/>
-        <w:gridCol w:w="726"/>
-        <w:gridCol w:w="804"/>
-        <w:gridCol w:w="731"/>
-        <w:gridCol w:w="781"/>
-        <w:gridCol w:w="696"/>
-      </w:tblGrid>
-      <w:tr>
-        <w:tc>
-          <w:tcPr>
-            <w:tcW w:w="705" w:type="dxa"/>
-            <w:shd w:val="clear" w:color="auto" w:fill="B8CCE4" w:themeFill="accent1" w:themeFillTint="66"/>
-          </w:tcPr>
-          <w:p>
-            <w:pPr>
-              <w:spacing w:line="360" w:lineRule="auto"/>
-              <w:rPr>
-                <w:b/>
-                <w:bCs/>
-              </w:rPr>
-            </w:pPr>
-            <w:r>
-              <w:rPr>
-                <w:b/>
-                <w:bCs/>
-              </w:rPr>
-              <w:t>Setting</w:t>
-            </w:r>
-          </w:p>
-        </w:tc>
-        <w:tc>
-          <w:tcPr>
-            <w:tcW w:w="805" w:type="dxa"/>
-            <w:shd w:val="clear" w:color="auto" w:fill="B8CCE4" w:themeFill="accent1" w:themeFillTint="66"/>
-          </w:tcPr>
-          <w:p>
-            <w:pPr>
-              <w:spacing w:line="360" w:lineRule="auto"/>
-              <w:rPr>
-                <w:b/>
-                <w:bCs/>
-              </w:rPr>
-            </w:pPr>
-            <w:r>
-              <w:rPr>
-                <w:b/>
-                <w:bCs/>
-              </w:rPr>
-              <w:t>PNG</w:t>
-            </w:r>
-          </w:p>
-        </w:tc>
-        <w:tc>
-          <w:tcPr>
-            <w:tcW w:w="784" w:type="dxa"/>
-            <w:shd w:val="clear" w:color="auto" w:fill="B8CCE4" w:themeFill="accent1" w:themeFillTint="66"/>
-          </w:tcPr>
-          <w:p>
-            <w:pPr>
-              <w:spacing w:line="360" w:lineRule="auto"/>
-              <w:rPr>
-                <w:b/>
-                <w:bCs/>
-              </w:rPr>
-            </w:pPr>
-            <w:r>
-              <w:rPr>
-                <w:b/>
-                <w:bCs/>
-              </w:rPr>
-              <w:t>JPG</w:t>
-            </w:r>
-          </w:p>
-        </w:tc>
-        <w:tc>
-          <w:tcPr>
-            <w:tcW w:w="784" w:type="dxa"/>
-            <w:shd w:val="clear" w:color="auto" w:fill="B8CCE4" w:themeFill="accent1" w:themeFillTint="66"/>
-          </w:tcPr>
-          <w:p>
-            <w:pPr>
-              <w:spacing w:line="360" w:lineRule="auto"/>
-              <w:rPr>
-                <w:b/>
-                <w:bCs/>
-              </w:rPr>
-            </w:pPr>
-            <w:r>
-              <w:rPr>
-                <w:b/>
-                <w:bCs/>
-              </w:rPr>
-              <w:t>GIF</w:t>
-            </w:r>
-          </w:p>
-        </w:tc>
-        <w:tc>
-          <w:tcPr>
-            <w:tcW w:w="819" w:type="dxa"/>
-            <w:shd w:val="clear" w:color="auto" w:fill="B8CCE4" w:themeFill="accent1" w:themeFillTint="66"/>
-          </w:tcPr>
-          <w:p>
-            <w:pPr>
-              <w:spacing w:line="360" w:lineRule="auto"/>
-              <w:rPr>
-                <w:b/>
-                <w:bCs/>
-              </w:rPr>
-            </w:pPr>
-            <w:r>
-              <w:rPr>
-                <w:b/>
-                <w:bCs/>
-              </w:rPr>
-              <w:t>MIDI</w:t>
-            </w:r>
-          </w:p>
-        </w:tc>
-        <w:tc>
-          <w:tcPr>
-            <w:tcW w:w="809" w:type="dxa"/>
-            <w:shd w:val="clear" w:color="auto" w:fill="B8CCE4" w:themeFill="accent1" w:themeFillTint="66"/>
-          </w:tcPr>
-          <w:p>
-            <w:pPr>
-              <w:spacing w:line="360" w:lineRule="auto"/>
-              <w:rPr>
-                <w:b/>
-                <w:bCs/>
-              </w:rPr>
-            </w:pPr>
-            <w:r>
-              <w:rPr>
-                <w:b/>
-                <w:bCs/>
-              </w:rPr>
-              <w:t>MP4</w:t>
-            </w:r>
-          </w:p>
-        </w:tc>
-        <w:tc>
-          <w:tcPr>
-            <w:tcW w:w="781" w:type="dxa"/>
-            <w:shd w:val="clear" w:color="auto" w:fill="B8CCE4" w:themeFill="accent1" w:themeFillTint="66"/>
-          </w:tcPr>
-          <w:p>
-            <w:pPr>
-              <w:spacing w:line="360" w:lineRule="auto"/>
-              <w:rPr>
-                <w:b/>
-                <w:bCs/>
-              </w:rPr>
-            </w:pPr>
-            <w:r>
-              <w:rPr>
-                <w:b/>
-                <w:bCs/>
-              </w:rPr>
-              <w:t>ZIP</w:t>
-            </w:r>
-          </w:p>
-        </w:tc>
-        <w:tc>
-          <w:tcPr>
-            <w:tcW w:w="830" w:type="dxa"/>
-            <w:shd w:val="clear" w:color="auto" w:fill="B8CCE4" w:themeFill="accent1" w:themeFillTint="66"/>
-          </w:tcPr>
-          <w:p>
-            <w:pPr>
-              <w:spacing w:line="360" w:lineRule="auto"/>
-              <w:rPr>
-                <w:b/>
-                <w:bCs/>
-              </w:rPr>
-            </w:pPr>
-            <w:r>
-              <w:rPr>
-                <w:b/>
-                <w:bCs/>
-              </w:rPr>
-              <w:t>PCAP</w:t>
-            </w:r>
-          </w:p>
-        </w:tc>
-        <w:tc>
-          <w:tcPr>
-            <w:tcW w:w="788" w:type="dxa"/>
-            <w:shd w:val="clear" w:color="auto" w:fill="B8CCE4" w:themeFill="accent1" w:themeFillTint="66"/>
-          </w:tcPr>
-          <w:p>
-            <w:pPr>
-              <w:spacing w:line="360" w:lineRule="auto"/>
-              <w:rPr>
-                <w:b/>
-                <w:bCs/>
-              </w:rPr>
-            </w:pPr>
-            <w:r>
-              <w:rPr>
-                <w:b/>
-                <w:bCs/>
-              </w:rPr>
-              <w:t>AVI</w:t>
-            </w:r>
-          </w:p>
-        </w:tc>
-        <w:tc>
-          <w:tcPr>
-            <w:tcW w:w="820" w:type="dxa"/>
-            <w:shd w:val="clear" w:color="auto" w:fill="B8CCE4" w:themeFill="accent1" w:themeFillTint="66"/>
-          </w:tcPr>
-          <w:p>
-            <w:pPr>
-              <w:spacing w:line="360" w:lineRule="auto"/>
-              <w:rPr>
-                <w:b/>
-                <w:bCs/>
-              </w:rPr>
-            </w:pPr>
-            <w:r>
-              <w:rPr>
-                <w:b/>
-                <w:bCs/>
-              </w:rPr>
-              <w:t>WAV</w:t>
-            </w:r>
-          </w:p>
-        </w:tc>
-        <w:tc>
-          <w:tcPr>
-            <w:tcW w:w="705" w:type="dxa"/>
-            <w:shd w:val="clear" w:color="auto" w:fill="B8CCE4" w:themeFill="accent1" w:themeFillTint="66"/>
-          </w:tcPr>
-          <w:p>
-            <w:pPr>
-              <w:spacing w:line="360" w:lineRule="auto"/>
-              <w:rPr>
-                <w:b/>
-                <w:bCs/>
-              </w:rPr>
-            </w:pPr>
-            <w:r>
-              <w:rPr>
-                <w:b/>
-                <w:bCs/>
-              </w:rPr>
-              <w:t>BMP</w:t>
-            </w:r>
-          </w:p>
-        </w:tc>
-      </w:tr>
-      <w:tr>
-        <w:tc>
-          <w:tcPr>
-            <w:tcW w:w="705" w:type="dxa"/>
-          </w:tcPr>
-          <w:p>
-            <w:pPr>
-              <w:spacing w:line="360" w:lineRule="auto"/>
-            </w:pPr>
-            <w:r>
-              <w:t>FF-paper</w:t>
-            </w:r>
-          </w:p>
-        </w:tc>
-        <w:tc>
-          <w:tcPr>
-            <w:tcW w:w="805" w:type="dxa"/>
-          </w:tcPr>
-          <w:p>
-            <w:pPr>
-              <w:spacing w:line="360" w:lineRule="auto"/>
-            </w:pPr>
-            <w:r>
-              <w:t>27.8</w:t>
-            </w:r>
-          </w:p>
-        </w:tc>
-        <w:tc>
-          <w:tcPr>
-            <w:tcW w:w="784" w:type="dxa"/>
-          </w:tcPr>
-          <w:p>
-            <w:pPr>
-              <w:spacing w:line="360" w:lineRule="auto"/>
-            </w:pPr>
-            <w:r>
-              <w:t>33.6</w:t>
-            </w:r>
-          </w:p>
-        </w:tc>
-        <w:tc>
-          <w:tcPr>
-            <w:tcW w:w="784" w:type="dxa"/>
-          </w:tcPr>
-          <w:p>
-            <w:pPr>
-              <w:spacing w:line="360" w:lineRule="auto"/>
-            </w:pPr>
-            <w:r>
-              <w:t>73.3</w:t>
-            </w:r>
-          </w:p>
-        </w:tc>
-        <w:tc>
-          <w:tcPr>
-            <w:tcW w:w="819" w:type="dxa"/>
-          </w:tcPr>
-          <w:p>
-            <w:pPr>
-              <w:spacing w:line="360" w:lineRule="auto"/>
-            </w:pPr>
-            <w:r>
-              <w:t>14.3</w:t>
-            </w:r>
-          </w:p>
-        </w:tc>
-        <w:tc>
-          <w:tcPr>
-            <w:tcW w:w="809" w:type="dxa"/>
-          </w:tcPr>
-          <w:p>
-            <w:pPr>
-              <w:spacing w:line="360" w:lineRule="auto"/>
-            </w:pPr>
-            <w:r>
-              <w:t>11.4</w:t>
-            </w:r>
-          </w:p>
-        </w:tc>
-        <w:tc>
-          <w:tcPr>
-            <w:tcW w:w="781" w:type="dxa"/>
-          </w:tcPr>
-          <w:p>
-            <w:pPr>
-              <w:spacing w:line="360" w:lineRule="auto"/>
-            </w:pPr>
-            <w:r>
-              <w:t>38.6</w:t>
-            </w:r>
-          </w:p>
-        </w:tc>
-        <w:tc>
-          <w:tcPr>
-            <w:tcW w:w="830" w:type="dxa"/>
-          </w:tcPr>
-          <w:p>
-            <w:pPr>
-              <w:spacing w:line="360" w:lineRule="auto"/>
-            </w:pPr>
-            <w:r>
-              <w:t>26.2</w:t>
-            </w:r>
-          </w:p>
-        </w:tc>
-        <w:tc>
-          <w:tcPr>
-            <w:tcW w:w="788" w:type="dxa"/>
-          </w:tcPr>
-          <w:p>
-            <w:pPr>
-              <w:spacing w:line="360" w:lineRule="auto"/>
-            </w:pPr>
-            <w:r>
-              <w:t>11.8</w:t>
-            </w:r>
-          </w:p>
-        </w:tc>
-        <w:tc>
-          <w:tcPr>
-            <w:tcW w:w="820" w:type="dxa"/>
-          </w:tcPr>
-          <w:p>
-            <w:pPr>
-              <w:spacing w:line="360" w:lineRule="auto"/>
-            </w:pPr>
-            <w:r>
-              <w:t>22.3</w:t>
-            </w:r>
-          </w:p>
-        </w:tc>
-        <w:tc>
-          <w:tcPr>
-            <w:tcW w:w="705" w:type="dxa"/>
-          </w:tcPr>
-          <w:p>
-            <w:pPr>
-              <w:spacing w:line="360" w:lineRule="auto"/>
-            </w:pPr>
-            <w:r>
-              <w:t>30.7</w:t>
-            </w:r>
-          </w:p>
-        </w:tc>
-      </w:tr>
-      <w:tr>
-        <w:tc>
-          <w:tcPr>
-            <w:tcW w:w="705" w:type="dxa"/>
-          </w:tcPr>
-          <w:p>
-            <w:pPr>
-              <w:spacing w:line="360" w:lineRule="auto"/>
-            </w:pPr>
-            <w:r>
-              <w:t>FF-templates</w:t>
-            </w:r>
-          </w:p>
-        </w:tc>
-        <w:tc>
-          <w:tcPr>
-            <w:tcW w:w="805" w:type="dxa"/>
-          </w:tcPr>
-          <w:p>
-            <w:pPr>
-              <w:spacing w:line="360" w:lineRule="auto"/>
-            </w:pPr>
-            <w:r>
-              <w:t>37.0</w:t>
-            </w:r>
-          </w:p>
-        </w:tc>
-        <w:tc>
-          <w:tcPr>
-            <w:tcW w:w="784" w:type="dxa"/>
-          </w:tcPr>
-          <w:p>
-            <w:pPr>
-              <w:spacing w:line="360" w:lineRule="auto"/>
-            </w:pPr>
-            <w:r>
-              <w:t>20.7</w:t>
-            </w:r>
-          </w:p>
-        </w:tc>
-        <w:tc>
-          <w:tcPr>
-            <w:tcW w:w="784" w:type="dxa"/>
-          </w:tcPr>
-          <w:p>
-            <w:pPr>
-              <w:spacing w:line="360" w:lineRule="auto"/>
-            </w:pPr>
-            <w:r>
-              <w:t>26.7</w:t>
-            </w:r>
-          </w:p>
-        </w:tc>
-        <w:tc>
-          <w:tcPr>
-            <w:tcW w:w="819" w:type="dxa"/>
-          </w:tcPr>
-          <w:p>
-            <w:pPr>
-              <w:spacing w:line="360" w:lineRule="auto"/>
-            </w:pPr>
-            <w:r>
-              <w:t>—</w:t>
-            </w:r>
-          </w:p>
-        </w:tc>
-        <w:tc>
-          <w:tcPr>
-            <w:tcW w:w="809" w:type="dxa"/>
-          </w:tcPr>
-          <w:p>
-            <w:pPr>
-              <w:spacing w:line="360" w:lineRule="auto"/>
-            </w:pPr>
-            <w:r>
-              <w:t>—</w:t>
-            </w:r>
-          </w:p>
-        </w:tc>
-        <w:tc>
-          <w:tcPr>
-            <w:tcW w:w="781" w:type="dxa"/>
-          </w:tcPr>
-          <w:p>
-            <w:pPr>
-              <w:spacing w:line="360" w:lineRule="auto"/>
-            </w:pPr>
-            <w:r>
-              <w:t>34.7</w:t>
-            </w:r>
-          </w:p>
-        </w:tc>
-        <w:tc>
-          <w:tcPr>
-            <w:tcW w:w="830" w:type="dxa"/>
-          </w:tcPr>
-          <w:p>
-            <w:pPr>
-              <w:spacing w:line="360" w:lineRule="auto"/>
-            </w:pPr>
-            <w:r>
-              <w:t>6.5</w:t>
-            </w:r>
-          </w:p>
-        </w:tc>
-        <w:tc>
-          <w:tcPr>
-            <w:tcW w:w="788" w:type="dxa"/>
-          </w:tcPr>
-          <w:p>
-            <w:pPr>
-              <w:spacing w:line="360" w:lineRule="auto"/>
-            </w:pPr>
-            <w:r>
-              <w:t>4.4</w:t>
-            </w:r>
-          </w:p>
-        </w:tc>
-        <w:tc>
-          <w:tcPr>
-            <w:tcW w:w="820" w:type="dxa"/>
-          </w:tcPr>
-          <w:p>
-            <w:pPr>
-              <w:spacing w:line="360" w:lineRule="auto"/>
-            </w:pPr>
-            <w:r>
-              <w:t>2.9</w:t>
-            </w:r>
-          </w:p>
-        </w:tc>
-        <w:tc>
-          <w:tcPr>
-            <w:tcW w:w="705" w:type="dxa"/>
-          </w:tcPr>
-          <w:p>
-            <w:pPr>
-              <w:spacing w:line="360" w:lineRule="auto"/>
-            </w:pPr>
-            <w:r>
-              <w:t>19.1</w:t>
-            </w:r>
-          </w:p>
-        </w:tc>
-      </w:tr>
-      <w:tr>
-        <w:tc>
-          <w:tcPr>
-            <w:tcW w:w="705" w:type="dxa"/>
-          </w:tcPr>
-          <w:p>
-            <w:pPr>
-              <w:spacing w:line="360" w:lineRule="auto"/>
-            </w:pPr>
-            <w:r>
-              <w:t>LLM-templates (Opus 4.7)</w:t>
-            </w:r>
-          </w:p>
-        </w:tc>
-        <w:tc>
-          <w:tcPr>
-            <w:tcW w:w="805" w:type="dxa"/>
-          </w:tcPr>
-          <w:p>
-            <w:pPr>
-              <w:spacing w:line="360" w:lineRule="auto"/>
-            </w:pPr>
-            <w:r>
-              <w:t>37.0</w:t>
-            </w:r>
-          </w:p>
-        </w:tc>
-        <w:tc>
-          <w:tcPr>
-            <w:tcW w:w="784" w:type="dxa"/>
-          </w:tcPr>
-          <w:p>
-            <w:pPr>
-              <w:spacing w:line="360" w:lineRule="auto"/>
-            </w:pPr>
-            <w:r>
-              <w:t>20.4</w:t>
-            </w:r>
-          </w:p>
-        </w:tc>
-        <w:tc>
-          <w:tcPr>
-            <w:tcW w:w="784" w:type="dxa"/>
-          </w:tcPr>
-          <w:p>
-            <w:pPr>
-              <w:spacing w:line="360" w:lineRule="auto"/>
-            </w:pPr>
-            <w:r>
-              <w:t>26.7</w:t>
-            </w:r>
-          </w:p>
-        </w:tc>
-        <w:tc>
-          <w:tcPr>
-            <w:tcW w:w="819" w:type="dxa"/>
-          </w:tcPr>
-          <w:p>
-            <w:pPr>
-              <w:spacing w:line="360" w:lineRule="auto"/>
-            </w:pPr>
-            <w:r>
-              <w:t>—</w:t>
-            </w:r>
-          </w:p>
-        </w:tc>
-        <w:tc>
-          <w:tcPr>
-            <w:tcW w:w="809" w:type="dxa"/>
-          </w:tcPr>
-          <w:p>
-            <w:pPr>
-              <w:spacing w:line="360" w:lineRule="auto"/>
-            </w:pPr>
-            <w:r>
-              <w:t>6.8</w:t>
-            </w:r>
-          </w:p>
-        </w:tc>
-        <w:tc>
-          <w:tcPr>
-            <w:tcW w:w="781" w:type="dxa"/>
-          </w:tcPr>
-          <w:p>
-            <w:pPr>
-              <w:spacing w:line="360" w:lineRule="auto"/>
-            </w:pPr>
-            <w:r>
-              <w:t>31.5</w:t>
-            </w:r>
-          </w:p>
-        </w:tc>
-        <w:tc>
-          <w:tcPr>
-            <w:tcW w:w="830" w:type="dxa"/>
-          </w:tcPr>
-          <w:p>
-            <w:pPr>
-              <w:spacing w:line="360" w:lineRule="auto"/>
-            </w:pPr>
-            <w:r>
-              <w:t>7.1</w:t>
-            </w:r>
-          </w:p>
-        </w:tc>
-        <w:tc>
-          <w:tcPr>
-            <w:tcW w:w="788" w:type="dxa"/>
-          </w:tcPr>
-          <w:p>
-            <w:pPr>
-              <w:spacing w:line="360" w:lineRule="auto"/>
-            </w:pPr>
-            <w:r>
-              <w:t>—</w:t>
-            </w:r>
-          </w:p>
-        </w:tc>
-        <w:tc>
-          <w:tcPr>
-            <w:tcW w:w="820" w:type="dxa"/>
-          </w:tcPr>
-          <w:p>
-            <w:pPr>
-              <w:spacing w:line="360" w:lineRule="auto"/>
-            </w:pPr>
-            <w:r>
-              <w:t>—</w:t>
-            </w:r>
-          </w:p>
-        </w:tc>
-        <w:tc>
-          <w:tcPr>
-            <w:tcW w:w="705" w:type="dxa"/>
-          </w:tcPr>
-          <w:p>
-            <w:pPr>
-              <w:spacing w:line="360" w:lineRule="auto"/>
-            </w:pPr>
-            <w:r>
-              <w:t>17.6</w:t>
-            </w:r>
-          </w:p>
-        </w:tc>
-      </w:tr>
-      <w:tr>
-        <w:tc>
-          <w:tcPr>
-            <w:tcW w:w="705" w:type="dxa"/>
-          </w:tcPr>
-          <w:p>
-            <w:pPr>
-              <w:spacing w:line="360" w:lineRule="auto"/>
-            </w:pPr>
-            <w:r>
-              <w:t>LLM-templates (Opus 5)</w:t>
-            </w:r>
-          </w:p>
-        </w:tc>
-        <w:tc>
-          <w:tcPr>
-            <w:tcW w:w="805" w:type="dxa"/>
-          </w:tcPr>
-          <w:p>
-            <w:pPr>
-              <w:spacing w:line="360" w:lineRule="auto"/>
-            </w:pPr>
-            <w:r>
-              <w:t>37.1</w:t>
-            </w:r>
-          </w:p>
-        </w:tc>
-        <w:tc>
-          <w:tcPr>
-            <w:tcW w:w="784" w:type="dxa"/>
-          </w:tcPr>
-          <w:p>
-            <w:pPr>
-              <w:spacing w:line="360" w:lineRule="auto"/>
-            </w:pPr>
-            <w:r>
-              <w:t>19.7</w:t>
-            </w:r>
-          </w:p>
-        </w:tc>
-        <w:tc>
-          <w:tcPr>
-            <w:tcW w:w="784" w:type="dxa"/>
-          </w:tcPr>
-          <w:p>
-            <w:pPr>
-              <w:spacing w:line="360" w:lineRule="auto"/>
-            </w:pPr>
-            <w:r>
-              <w:t>26.8</w:t>
-            </w:r>
-          </w:p>
-        </w:tc>
-        <w:tc>
-          <w:tcPr>
-            <w:tcW w:w="819" w:type="dxa"/>
-          </w:tcPr>
-          <w:p>
-            <w:pPr>
-              <w:spacing w:line="360" w:lineRule="auto"/>
-            </w:pPr>
-            <w:r>
-              <w:t>9.8</w:t>
-            </w:r>
-          </w:p>
-        </w:tc>
-        <w:tc>
-          <w:tcPr>
-            <w:tcW w:w="809" w:type="dxa"/>
-          </w:tcPr>
-          <w:p>
-            <w:pPr>
-              <w:spacing w:line="360" w:lineRule="auto"/>
-            </w:pPr>
-            <w:r>
-              <w:t>7.1</w:t>
-            </w:r>
-          </w:p>
-        </w:tc>
-        <w:tc>
-          <w:tcPr>
-            <w:tcW w:w="781" w:type="dxa"/>
-          </w:tcPr>
-          <w:p>
-            <w:pPr>
-              <w:spacing w:line="360" w:lineRule="auto"/>
-            </w:pPr>
-            <w:r>
-              <w:t>34.9</w:t>
-            </w:r>
-          </w:p>
-        </w:tc>
-        <w:tc>
-          <w:tcPr>
-            <w:tcW w:w="830" w:type="dxa"/>
-          </w:tcPr>
-          <w:p>
-            <w:pPr>
-              <w:spacing w:line="360" w:lineRule="auto"/>
-            </w:pPr>
-            <w:r>
-              <w:t>13.3</w:t>
-            </w:r>
-          </w:p>
-        </w:tc>
-        <w:tc>
-          <w:tcPr>
-            <w:tcW w:w="788" w:type="dxa"/>
-          </w:tcPr>
-          <w:p>
-            <w:pPr>
-              <w:spacing w:line="360" w:lineRule="auto"/>
-            </w:pPr>
-            <w:r>
-              <w:t>7.1</w:t>
-            </w:r>
-          </w:p>
-        </w:tc>
-        <w:tc>
-          <w:tcPr>
-            <w:tcW w:w="820" w:type="dxa"/>
-          </w:tcPr>
-          <w:p>
-            <w:pPr>
-              <w:spacing w:line="360" w:lineRule="auto"/>
-            </w:pPr>
-            <w:r>
-              <w:t>3.0</w:t>
-            </w:r>
-          </w:p>
-        </w:tc>
-        <w:tc>
-          <w:tcPr>
-            <w:tcW w:w="705" w:type="dxa"/>
-          </w:tcPr>
-          <w:p>
-            <w:pPr>
-              <w:spacing w:line="360" w:lineRule="auto"/>
-            </w:pPr>
-            <w:r>
-              <w:t>19.1</w:t>
-            </w:r>
-          </w:p>
-        </w:tc>
-      </w:tr>
-    </w:tbl>
-    <w:p>
-      <w:pPr>
         <w:rPr>
           <w:rFonts w:asciiTheme="majorHAnsi" w:eastAsiaTheme="majorEastAsia" w:hAnsiTheme="majorHAnsi" w:cstheme="majorBidi"/>
           <w:b/>
@@ -15568,7 +14024,7 @@
         </w:rPr>
       </w:pPr>
       <w:r>
-        <w:t>Line coverage (%) of the target program after an 8-hour AFL+FFMut campaign per format, read from each run's final/meta.json. FF-templates and LLM-templates (Opus 4.7) come from coverage_results_opus4-7_templates/ (runs of 2026-09-01); LLM-templates (Opus 5) from coverage_results/ (runs of 2026-09-07, with png and midi completed 2026-09-08/09). All supersede the earlier figures invalidated by the shared-gcov defect that pooled the two variants into one set of counters. The Opus 5 row is complete for all ten formats; — marks a run that never completed in the older sets: midi produced no snapshot for FF-templates or Opus 4.7, mp4/FF-templates stopped after 1 h at 6.7%, and avi and wav were absent from the Opus 4.7 LLM set. The FF-paper row is a 24-hour, 10-repetition campaign against 2021-era target versions and is not directly comparable to these single 8-hour runs.</w:t>
+        <w:br w:type="page"/>
       </w:r>
     </w:p>
     <w:p>
@@ -15576,27 +14032,15 @@
         <w:pStyle w:val="Heading3"/>
       </w:pPr>
       <w:r>
+        <w:lastRenderedPageBreak/>
         <w:t>Fandango</w:t>
       </w:r>
     </w:p>
-    <w:p/>
-    <w:p>
-      <w:r>
-        <w:br w:type="page"/>
-      </w:r>
-    </w:p>
-    <w:p>
-      <w:pPr>
-        <w:shd w:val="clear" w:color="auto" w:fill="FFFFFF" w:themeFill="background1"/>
-        <w:rPr>
-          <w:color w:val="000000" w:themeColor="text1"/>
-        </w:rPr>
-      </w:pPr>
-      <w:r>
-        <w:rPr>
-          <w:color w:val="000000" w:themeColor="text1"/>
-        </w:rPr>
-        <w:lastRenderedPageBreak/>
+    <w:p>
+      <w:r>
+        <w:rPr>
+          <w:color w:val="000000" w:themeColor="text1"/>
+        </w:rPr>
         <w:t xml:space="preserve">Seed files AFL FFMUT </w:t>
       </w:r>
     </w:p>

</xml_diff>